<commit_message>
docs(bao-cao): vẽ ERD đúng 9 entity MVP + gộp TimestampMixin vào từng bảng
- Tạo make_erd.py vẽ ERD bằng matplotlib (9 entity: User, Partner, PartnerStaff,
  Membership, Reward, Redemption, Transaction, PointLedger, LoginLog).
- Mỗi entity inline created_at/updated_at; TimestampMixin chỉ là Python mixin,
  không vẽ thành bảng riêng (theo yêu cầu user).
- Fix bảng ERD ở 3.1.1: bỏ PointAdjustment (không có bảng — thực tế là
  point_ledger reason='adjust') và VerificationCode (đã DROP ở migration
  f1a2b3c4d5e6).
- Thêm đoạn giải thích TimestampMixin và cách lưu adjustment.
- Rebuild bao-cao-mvp.docx.
</commit_message>
<xml_diff>
--- a/bao-cao/bao-cao-mvp.docx
+++ b/bao-cao/bao-cao-mvp.docx
@@ -4932,20 +4932,60 @@
           <w:rFonts w:ascii="Times New Roman" w:hAnsi="Times New Roman" w:cs="Times New Roman" w:eastAsia="Times New Roman"/>
           <w:sz w:val="26"/>
         </w:rPr>
-        <w:t>Ở mức ý niệm, hệ thống được mô hình hóa thành các thực thể chính phản ánh các đối tượng nghiệp vụ cốt lõi. Mỗi thực thể đại diện cho một khái niệm nghiệp vụ độc lập và có quan hệ rõ ràng với các thực thể xung quanh. Sơ đồ ERD tổng thể được trình bày trong hình dưới đây, còn bảng này mô tả vai trò của từng thực thể chính.</w:t>
+        <w:t>Ở mức ý niệm, hệ thống được mô hình hóa thành chín thực thể chính phản ánh các đối tượng nghiệp vụ cốt lõi. Mỗi thực thể đại diện cho một khái niệm nghiệp vụ độc lập và có quan hệ rõ ràng với các thực thể xung quanh. Sơ đồ ERD tổng thể được trình bày trong hình dưới đây, còn bảng kế tiếp mô tả vai trò của từng thực thể.</w:t>
       </w:r>
     </w:p>
     <w:p>
       <w:pPr>
-        <w:jc w:val="center"/>
+        <w:spacing w:line="312" w:lineRule="auto" w:after="120"/>
+        <w:ind w:firstLine="283"/>
+        <w:jc w:val="both"/>
       </w:pPr>
       <w:r>
         <w:rPr>
           <w:rFonts w:ascii="Times New Roman" w:hAnsi="Times New Roman" w:cs="Times New Roman" w:eastAsia="Times New Roman"/>
-          <w:i/>
           <w:sz w:val="26"/>
         </w:rPr>
-        <w:t>[HÌNH MISSING: D:\DoAn\bao-cao\assets\uml\erd.png]</w:t>
+        <w:t>Lưu ý về TimestampMixin: hai cột created_at và updated_at được khai báo tập trung trong lớp TimestampMixin của tệp app/models/base.py, sau đó được kế thừa vào hầu hết các bảng (User, Partner, PartnerStaff, Membership, Reward, Redemption, Transaction, PointLedger). Đây là kỹ thuật mixin của Python để tránh lặp code, không phải một bảng riêng — vì vậy ERD chỉ vẽ chín thực thể nghiệp vụ và liệt kê created_at / updated_at trực tiếp bên trong mỗi thực thể.</w:t>
+      </w:r>
+    </w:p>
+    <w:p>
+      <w:pPr>
+        <w:jc w:val="center"/>
+      </w:pPr>
+      <w:r>
+        <w:drawing>
+          <wp:inline xmlns:a="http://schemas.openxmlformats.org/drawingml/2006/main" xmlns:pic="http://schemas.openxmlformats.org/drawingml/2006/picture">
+            <wp:extent cx="5040000" cy="3038684"/>
+            <wp:docPr id="1" name="Picture 1"/>
+            <wp:cNvGraphicFramePr>
+              <a:graphicFrameLocks noChangeAspect="1"/>
+            </wp:cNvGraphicFramePr>
+            <a:graphic>
+              <a:graphicData uri="http://schemas.openxmlformats.org/drawingml/2006/picture">
+                <pic:pic>
+                  <pic:nvPicPr>
+                    <pic:cNvPr id="0" name="erd.png"/>
+                    <pic:cNvPicPr/>
+                  </pic:nvPicPr>
+                  <pic:blipFill>
+                    <a:blip r:embed="rId29"/>
+                    <a:stretch>
+                      <a:fillRect/>
+                    </a:stretch>
+                  </pic:blipFill>
+                  <pic:spPr>
+                    <a:xfrm>
+                      <a:off x="0" y="0"/>
+                      <a:ext cx="5040000" cy="3038684"/>
+                    </a:xfrm>
+                    <a:prstGeom prst="rect"/>
+                  </pic:spPr>
+                </pic:pic>
+              </a:graphicData>
+            </a:graphic>
+          </wp:inline>
+        </w:drawing>
       </w:r>
     </w:p>
     <w:p>
@@ -4969,7 +5009,7 @@
           <w:i/>
           <w:sz w:val="24"/>
         </w:rPr>
-        <w:t>ERD tổng thể các thực thể chính của hệ thống.</w:t>
+        <w:t>ERD tổng thể chín thực thể chính của hệ thống.</w:t>
       </w:r>
     </w:p>
     <w:tbl>
@@ -5060,7 +5100,7 @@
                 <w:rFonts w:ascii="Times New Roman" w:hAnsi="Times New Roman" w:cs="Times New Roman" w:eastAsia="Times New Roman"/>
                 <w:sz w:val="26"/>
               </w:rPr>
-              <w:t>Người dùng hệ thống — khách hàng, chủ partner, nhân viên hoặc admin</w:t>
+              <w:t>Người dùng hệ thống — khách hàng, chủ partner, nhân viên hoặc admin; ví điểm toàn cục points_balance ≥ 0</w:t>
             </w:r>
           </w:p>
         </w:tc>
@@ -5169,7 +5209,7 @@
                 <w:rFonts w:ascii="Times New Roman" w:hAnsi="Times New Roman" w:cs="Times New Roman" w:eastAsia="Times New Roman"/>
                 <w:sz w:val="26"/>
               </w:rPr>
-              <w:t>N User ↔ N Partner qua PartnerStaff</w:t>
+              <w:t>1 User ↔ tối đa 1 Partner qua PartnerStaff (uniq user_id)</w:t>
             </w:r>
           </w:p>
         </w:tc>
@@ -5201,7 +5241,7 @@
                 <w:rFonts w:ascii="Times New Roman" w:hAnsi="Times New Roman" w:cs="Times New Roman" w:eastAsia="Times New Roman"/>
                 <w:sz w:val="26"/>
               </w:rPr>
-              <w:t>Quan hệ khách hàng – partner; lưu lifetime_earned</w:t>
+              <w:t>Quan hệ khách hàng – partner; lưu lifetime_earned cho hạng thành viên</w:t>
             </w:r>
           </w:p>
         </w:tc>
@@ -5216,7 +5256,7 @@
                 <w:rFonts w:ascii="Times New Roman" w:hAnsi="Times New Roman" w:cs="Times New Roman" w:eastAsia="Times New Roman"/>
                 <w:sz w:val="26"/>
               </w:rPr>
-              <w:t>1 User + 1 Partner → 1 Membership (unique)</w:t>
+              <w:t>UNIQUE(partner_id, user_id) → 1 Membership</w:t>
             </w:r>
           </w:p>
         </w:tc>
@@ -5295,7 +5335,7 @@
                 <w:rFonts w:ascii="Times New Roman" w:hAnsi="Times New Roman" w:cs="Times New Roman" w:eastAsia="Times New Roman"/>
                 <w:sz w:val="26"/>
               </w:rPr>
-              <w:t>Lệnh đổi quà đã thực hiện; mang mã 8 ký tự để dùng tại POS</w:t>
+              <w:t>Lệnh đổi quà; mang redemption_code 8 ký tự để dùng tại POS</w:t>
             </w:r>
           </w:p>
         </w:tc>
@@ -5310,7 +5350,7 @@
                 <w:rFonts w:ascii="Times New Roman" w:hAnsi="Times New Roman" w:cs="Times New Roman" w:eastAsia="Times New Roman"/>
                 <w:sz w:val="26"/>
               </w:rPr>
-              <w:t>1 User + 1 Reward → 1 Redemption</w:t>
+              <w:t>1 User + 1 Reward → nhiều Redemption</w:t>
             </w:r>
           </w:p>
         </w:tc>
@@ -5389,7 +5429,7 @@
                 <w:rFonts w:ascii="Times New Roman" w:hAnsi="Times New Roman" w:cs="Times New Roman" w:eastAsia="Times New Roman"/>
                 <w:sz w:val="26"/>
               </w:rPr>
-              <w:t>Sổ cái điểm append-only ghi mọi biến động điểm toàn cục</w:t>
+              <w:t>Sổ cái điểm append-only ghi mọi biến động (earn / redeem / adjust / expire / refund). Cột actor_user_id ghi nhận chủ shop khi điều chỉnh thủ công</w:t>
             </w:r>
           </w:p>
         </w:tc>
@@ -5404,7 +5444,7 @@
                 <w:rFonts w:ascii="Times New Roman" w:hAnsi="Times New Roman" w:cs="Times New Roman" w:eastAsia="Times New Roman"/>
                 <w:sz w:val="26"/>
               </w:rPr>
-              <w:t>1 User → nhiều PointLedger entry</w:t>
+              <w:t>1 User → nhiều entry (cross-partner)</w:t>
             </w:r>
           </w:p>
         </w:tc>
@@ -5421,7 +5461,7 @@
                 <w:rFonts w:ascii="Times New Roman" w:hAnsi="Times New Roman" w:cs="Times New Roman" w:eastAsia="Times New Roman"/>
                 <w:sz w:val="26"/>
               </w:rPr>
-              <w:t>PointAdjustment</w:t>
+              <w:t>LoginLog</w:t>
             </w:r>
           </w:p>
         </w:tc>
@@ -5436,7 +5476,7 @@
                 <w:rFonts w:ascii="Times New Roman" w:hAnsi="Times New Roman" w:cs="Times New Roman" w:eastAsia="Times New Roman"/>
                 <w:sz w:val="26"/>
               </w:rPr>
-              <w:t>Điều chỉnh điểm thủ công do owner thực hiện</w:t>
+              <w:t>Nhật ký đăng nhập (thành công / thất bại) để admin kiểm toán</w:t>
             </w:r>
           </w:p>
         </w:tc>
@@ -5451,101 +5491,7 @@
                 <w:rFonts w:ascii="Times New Roman" w:hAnsi="Times New Roman" w:cs="Times New Roman" w:eastAsia="Times New Roman"/>
                 <w:sz w:val="26"/>
               </w:rPr>
-              <w:t>1 Membership + actor User → 1 PointAdjustment</w:t>
-            </w:r>
-          </w:p>
-        </w:tc>
-      </w:tr>
-      <w:tr>
-        <w:tc>
-          <w:tcPr>
-            <w:tcW w:type="dxa" w:w="3135"/>
-          </w:tcPr>
-          <w:p>
-            <w:r/>
-            <w:r>
-              <w:rPr>
-                <w:rFonts w:ascii="Times New Roman" w:hAnsi="Times New Roman" w:cs="Times New Roman" w:eastAsia="Times New Roman"/>
-                <w:sz w:val="26"/>
-              </w:rPr>
-              <w:t>LoginLog</w:t>
-            </w:r>
-          </w:p>
-        </w:tc>
-        <w:tc>
-          <w:tcPr>
-            <w:tcW w:type="dxa" w:w="3135"/>
-          </w:tcPr>
-          <w:p>
-            <w:r/>
-            <w:r>
-              <w:rPr>
-                <w:rFonts w:ascii="Times New Roman" w:hAnsi="Times New Roman" w:cs="Times New Roman" w:eastAsia="Times New Roman"/>
-                <w:sz w:val="26"/>
-              </w:rPr>
-              <w:t>Nhật ký đăng nhập để admin kiểm toán</w:t>
-            </w:r>
-          </w:p>
-        </w:tc>
-        <w:tc>
-          <w:tcPr>
-            <w:tcW w:type="dxa" w:w="3135"/>
-          </w:tcPr>
-          <w:p>
-            <w:r/>
-            <w:r>
-              <w:rPr>
-                <w:rFonts w:ascii="Times New Roman" w:hAnsi="Times New Roman" w:cs="Times New Roman" w:eastAsia="Times New Roman"/>
-                <w:sz w:val="26"/>
-              </w:rPr>
               <w:t>1 User → nhiều LoginLog</w:t>
-            </w:r>
-          </w:p>
-        </w:tc>
-      </w:tr>
-      <w:tr>
-        <w:tc>
-          <w:tcPr>
-            <w:tcW w:type="dxa" w:w="3135"/>
-          </w:tcPr>
-          <w:p>
-            <w:r/>
-            <w:r>
-              <w:rPr>
-                <w:rFonts w:ascii="Times New Roman" w:hAnsi="Times New Roman" w:cs="Times New Roman" w:eastAsia="Times New Roman"/>
-                <w:sz w:val="26"/>
-              </w:rPr>
-              <w:t>VerificationCode</w:t>
-            </w:r>
-          </w:p>
-        </w:tc>
-        <w:tc>
-          <w:tcPr>
-            <w:tcW w:type="dxa" w:w="3135"/>
-          </w:tcPr>
-          <w:p>
-            <w:r/>
-            <w:r>
-              <w:rPr>
-                <w:rFonts w:ascii="Times New Roman" w:hAnsi="Times New Roman" w:cs="Times New Roman" w:eastAsia="Times New Roman"/>
-                <w:sz w:val="26"/>
-              </w:rPr>
-              <w:t>Mã xác thực đa mục đích (forgot password, v.v.)</w:t>
-            </w:r>
-          </w:p>
-        </w:tc>
-        <w:tc>
-          <w:tcPr>
-            <w:tcW w:type="dxa" w:w="3135"/>
-          </w:tcPr>
-          <w:p>
-            <w:r/>
-            <w:r>
-              <w:rPr>
-                <w:rFonts w:ascii="Times New Roman" w:hAnsi="Times New Roman" w:cs="Times New Roman" w:eastAsia="Times New Roman"/>
-                <w:sz w:val="26"/>
-              </w:rPr>
-              <w:t>1 User → nhiều VerificationCode</w:t>
             </w:r>
           </w:p>
         </w:tc>
@@ -5571,7 +5517,21 @@
           <w:i/>
           <w:sz w:val="24"/>
         </w:rPr>
-        <w:t>Các thực thể chính và quan hệ ở mức ý niệm.</w:t>
+        <w:t>Chín thực thể chính và quan hệ ở mức ý niệm.</w:t>
+      </w:r>
+    </w:p>
+    <w:p>
+      <w:pPr>
+        <w:spacing w:line="312" w:lineRule="auto" w:after="120"/>
+        <w:ind w:firstLine="283"/>
+        <w:jc w:val="both"/>
+      </w:pPr>
+      <w:r>
+        <w:rPr>
+          <w:rFonts w:ascii="Times New Roman" w:hAnsi="Times New Roman" w:cs="Times New Roman" w:eastAsia="Times New Roman"/>
+          <w:sz w:val="26"/>
+        </w:rPr>
+        <w:t>Việc điều chỉnh điểm thủ công của chủ shop không có bảng riêng: mỗi lần điều chỉnh chỉ INSERT một bản ghi vào point_ledger với reason = 'adjust', actor_user_id = chủ shop và description = lý do. Cách này tận dụng được trigger append-only của point_ledger nên không thể UPDATE / DELETE để xoá dấu vết, đồng thời tránh trùng lặp dữ liệu với một bảng PointAdjustment riêng.</w:t>
       </w:r>
     </w:p>
     <w:p>
@@ -14093,10 +14053,10 @@
     <w:p>
       <w:pPr>
         <w:sectPr>
-          <w:headerReference w:type="default" r:id="rId29"/>
-          <w:footerReference w:type="default" r:id="rId30"/>
-          <w:headerReference w:type="first" r:id="rId31"/>
-          <w:footerReference w:type="first" r:id="rId32"/>
+          <w:headerReference w:type="default" r:id="rId30"/>
+          <w:footerReference w:type="default" r:id="rId31"/>
+          <w:headerReference w:type="first" r:id="rId32"/>
+          <w:footerReference w:type="first" r:id="rId33"/>
           <w:pgSz w:w="12240" w:h="15840"/>
           <w:pgMar w:top="1134" w:right="1134" w:bottom="1134" w:left="1701" w:header="720" w:footer="720" w:gutter="0"/>
           <w:cols w:space="720"/>
@@ -15128,10 +15088,10 @@
     <w:p>
       <w:pPr>
         <w:sectPr>
-          <w:headerReference w:type="default" r:id="rId33"/>
-          <w:footerReference w:type="default" r:id="rId34"/>
-          <w:headerReference w:type="first" r:id="rId35"/>
-          <w:footerReference w:type="first" r:id="rId36"/>
+          <w:headerReference w:type="default" r:id="rId34"/>
+          <w:footerReference w:type="default" r:id="rId35"/>
+          <w:headerReference w:type="first" r:id="rId36"/>
+          <w:footerReference w:type="first" r:id="rId37"/>
           <w:pgSz w:w="12240" w:h="15840"/>
           <w:pgMar w:top="1134" w:right="1134" w:bottom="1134" w:left="1701" w:header="720" w:footer="720" w:gutter="0"/>
           <w:cols w:space="720"/>
@@ -15765,10 +15725,10 @@
     <w:p>
       <w:pPr>
         <w:sectPr>
-          <w:headerReference w:type="default" r:id="rId37"/>
-          <w:footerReference w:type="default" r:id="rId38"/>
-          <w:headerReference w:type="first" r:id="rId39"/>
-          <w:footerReference w:type="first" r:id="rId40"/>
+          <w:headerReference w:type="default" r:id="rId38"/>
+          <w:footerReference w:type="default" r:id="rId39"/>
+          <w:headerReference w:type="first" r:id="rId40"/>
+          <w:footerReference w:type="first" r:id="rId41"/>
           <w:pgSz w:w="12240" w:h="15840"/>
           <w:pgMar w:top="1134" w:right="1134" w:bottom="1134" w:left="1701" w:header="720" w:footer="720" w:gutter="0"/>
           <w:cols w:space="720"/>
@@ -15974,10 +15934,10 @@
       </w:r>
     </w:p>
     <w:sectPr>
-      <w:headerReference w:type="default" r:id="rId41"/>
-      <w:footerReference w:type="default" r:id="rId42"/>
-      <w:headerReference w:type="first" r:id="rId43"/>
-      <w:footerReference w:type="first" r:id="rId44"/>
+      <w:headerReference w:type="default" r:id="rId42"/>
+      <w:footerReference w:type="default" r:id="rId43"/>
+      <w:headerReference w:type="first" r:id="rId44"/>
+      <w:footerReference w:type="first" r:id="rId45"/>
       <w:pgSz w:w="12240" w:h="15840"/>
       <w:pgMar w:top="1134" w:right="1134" w:bottom="1134" w:left="1701" w:header="720" w:footer="720" w:gutter="0"/>
       <w:cols w:space="720"/>

</xml_diff>

<commit_message>
docs(bao-cao): bổ sung 3 điểm yếu kiến trúc + sync JWT TTL với code
- Chương 3: sửa JWT TTL "7 ngày" → "24 giờ" (khớp access_token_expire_minutes=60*24) + ghi nhận refresh token 30 ngày.
- Chương 5.2: thêm 3 mục từ rà soát defense Q&A:
  - 5.2.6 Shared Schema thiếu RLS defense-in-depth
  - 5.2.7 Ledger trigger không kháng được superuser DROP TRIGGER
  - 5.2.8 JWT 24h không có cơ chế revoke khi đổi password

Why: trung thực với trade-off thay vì giấu — báo cáo phải khớp code và ghi nhận hạn chế thực tế trước khi đưa lên prod quy mô lớn.
</commit_message>
<xml_diff>
--- a/bao-cao/bao-cao-mvp.docx
+++ b/bao-cao/bao-cao-mvp.docx
@@ -6367,7 +6367,7 @@
               <w:br/>
               <w:t>2. Frontend POST /auth/login.</w:t>
               <w:br/>
-              <w:t>3. Backend xác thực bcrypt; nếu đúng, phát JWT (HS256, 7 ngày).</w:t>
+              <w:t>3. Backend xác thực bcrypt; nếu đúng, phát access token JWT (HS256, 24 giờ) và refresh token (30 ngày).</w:t>
               <w:br/>
               <w:t>4. Frontend lưu token vào localStorage, chuyển hướng về trang chính của role.</w:t>
             </w:r>
@@ -7496,7 +7496,7 @@
           <w:rFonts w:ascii="Times New Roman" w:hAnsi="Times New Roman" w:cs="Times New Roman" w:eastAsia="Times New Roman"/>
           <w:sz w:val="26"/>
         </w:rPr>
-        <w:t>Luồng đăng nhập JWT: Người dùng submit form đăng nhập → Frontend gọi POST /auth/login với email/phone và password → Backend tra cứu user theo email/phone → Xác thực bcrypt(password, password_hash) → Nếu đúng, ký JWT bằng SECRET_KEY (HS256, payload chứa user_id và system_role, exp = 7 ngày) → Trả access_token về Frontend → Frontend lưu vào localStorage → axios interceptor tự động thêm Authorization: Bearer {token} vào mọi request tiếp theo. Mỗi lần đăng nhập thành công, backend INSERT một bản ghi vào bảng login_logs.</w:t>
+        <w:t>Luồng đăng nhập JWT: Người dùng submit form đăng nhập → Frontend gọi POST /auth/login với email/phone và password → Backend tra cứu user theo email/phone → Xác thực bcrypt(password, password_hash) → Nếu đúng, ký JWT bằng SECRET_KEY (HS256, payload chứa user_id và system_role, exp = 24 giờ; refresh token có exp 30 ngày) → Trả access_token về Frontend → Frontend lưu vào localStorage → axios interceptor tự động thêm Authorization: Bearer {token} vào mọi request tiếp theo. Mỗi lần đăng nhập thành công, backend INSERT một bản ghi vào bảng login_logs.</w:t>
       </w:r>
     </w:p>
     <w:p>
@@ -14956,6 +14956,93 @@
           <w:sz w:val="26"/>
         </w:rPr>
         <w:t>Cơ chế fail-silent cho SMTP giúp bảo mật bằng cách không tiết lộ email nào tồn tại. Tuy nhiên, người dùng thực sự quên mật khẩu sẽ không nhận được thông báo nếu email không được gửi — họ chỉ thấy 'Thành công' mà không nhận email. Giải pháp phù hợp cho sản xuất là xây dựng dashboard SMTP log cho admin xem các email gửi thất bại, hoặc retry queue để tự động gửi lại khi SMTP phục hồi.</w:t>
+      </w:r>
+    </w:p>
+    <w:p>
+      <w:pPr>
+        <w:pStyle w:val="Heading3"/>
+        <w:spacing w:line="312" w:lineRule="auto" w:after="80" w:before="160"/>
+        <w:jc w:val="left"/>
+      </w:pPr>
+      <w:r>
+        <w:rPr>
+          <w:rFonts w:ascii="Times New Roman" w:hAnsi="Times New Roman" w:cs="Times New Roman" w:eastAsia="Times New Roman"/>
+          <w:b/>
+          <w:sz w:val="28"/>
+        </w:rPr>
+        <w:t>5.2.6. Multi-tenant Shared Schema thiếu defense-in-depth ở tầng DB</w:t>
+      </w:r>
+    </w:p>
+    <w:p>
+      <w:pPr>
+        <w:spacing w:line="312" w:lineRule="auto" w:after="120"/>
+        <w:ind w:firstLine="283"/>
+        <w:jc w:val="both"/>
+      </w:pPr>
+      <w:r>
+        <w:rPr>
+          <w:rFonts w:ascii="Times New Roman" w:hAnsi="Times New Roman" w:cs="Times New Roman" w:eastAsia="Times New Roman"/>
+          <w:sz w:val="26"/>
+        </w:rPr>
+        <w:t>Mô hình Shared Schema được lựa chọn để giữ chi phí vận hành thấp và phù hợp với scope đồ án. Tuy nhiên, cô lập dữ liệu giữa các partner hiện chỉ dựa trên application-level filter (mỗi query đều thêm điều kiện partner_id = X) và dependency require_owner_in_tenant. Nếu một endpoint trong tương lai quên thêm filter, dữ liệu của partner khác có thể bị rò rỉ. Giải pháp tiêu chuẩn công nghiệp là bật PostgreSQL Row-Level Security (RLS) — tạo policy ràng buộc row trả về phải có partner_id khớp với biến session current_setting('app.partner_id'). Khi đó, ngay cả khi application code có lỗi cũng không thể đọc dữ liệu sai tenant. Đây là cải tiến quan trọng cần thực hiện trước khi đưa hệ thống lên môi trường multi-tenant thực sự.</w:t>
+      </w:r>
+    </w:p>
+    <w:p>
+      <w:pPr>
+        <w:pStyle w:val="Heading3"/>
+        <w:spacing w:line="312" w:lineRule="auto" w:after="80" w:before="160"/>
+        <w:jc w:val="left"/>
+      </w:pPr>
+      <w:r>
+        <w:rPr>
+          <w:rFonts w:ascii="Times New Roman" w:hAnsi="Times New Roman" w:cs="Times New Roman" w:eastAsia="Times New Roman"/>
+          <w:b/>
+          <w:sz w:val="28"/>
+        </w:rPr>
+        <w:t>5.2.7. Append-only ledger không kháng được tấn công ở tầng superuser</w:t>
+      </w:r>
+    </w:p>
+    <w:p>
+      <w:pPr>
+        <w:spacing w:line="312" w:lineRule="auto" w:after="120"/>
+        <w:ind w:firstLine="283"/>
+        <w:jc w:val="both"/>
+      </w:pPr>
+      <w:r>
+        <w:rPr>
+          <w:rFonts w:ascii="Times New Roman" w:hAnsi="Times New Roman" w:cs="Times New Roman" w:eastAsia="Times New Roman"/>
+          <w:sz w:val="26"/>
+        </w:rPr>
+        <w:t>Trigger no_update_or_delete_point_ledger chặn mọi UPDATE/DELETE từ application code và các tài khoản DB thường. Tuy nhiên, người có quyền superuser PostgreSQL vẫn có thể DROP TRIGGER, sửa dữ liệu, rồi tạo lại trigger — toàn bộ thao tác này không để lại dấu vết trong ledger. Đây là giới hạn cố hữu của bất kỳ trigger-based approach nào. Hai giải pháp triệt để: (a) bật pgaudit để log DDL/DML có quyền cao và push log sang hệ thống lưu trữ riêng ngoài tầm kiểm soát của DB admin; (b) chuyển sang hash-chained ledger — mỗi ledger entry chứa hash của entry trước đó, do đó bất kỳ thay đổi nào ở giữa chuỗi cũng sẽ phá vỡ chuỗi hash và bị phát hiện khi đối soát định kỳ. Hướng (b) là giải pháp đầy đủ nhất nhưng vượt scope đồ án.</w:t>
+      </w:r>
+    </w:p>
+    <w:p>
+      <w:pPr>
+        <w:pStyle w:val="Heading3"/>
+        <w:spacing w:line="312" w:lineRule="auto" w:after="80" w:before="160"/>
+        <w:jc w:val="left"/>
+      </w:pPr>
+      <w:r>
+        <w:rPr>
+          <w:rFonts w:ascii="Times New Roman" w:hAnsi="Times New Roman" w:cs="Times New Roman" w:eastAsia="Times New Roman"/>
+          <w:b/>
+          <w:sz w:val="28"/>
+        </w:rPr>
+        <w:t>5.2.8. JWT 24 giờ không có cơ chế revoke khi đổi password</w:t>
+      </w:r>
+    </w:p>
+    <w:p>
+      <w:pPr>
+        <w:spacing w:line="312" w:lineRule="auto" w:after="120"/>
+        <w:ind w:firstLine="283"/>
+        <w:jc w:val="both"/>
+      </w:pPr>
+      <w:r>
+        <w:rPr>
+          <w:rFonts w:ascii="Times New Roman" w:hAnsi="Times New Roman" w:cs="Times New Roman" w:eastAsia="Times New Roman"/>
+          <w:sz w:val="26"/>
+        </w:rPr>
+        <w:t>Access token JWT hiện tại có thời gian sống 24 giờ và là stateless (server không lưu trạng thái token). Khi user đổi password hoặc owner khoá tài khoản nhân viên, các access token đã phát từ trước vẫn còn hiệu lực trong tối đa 24 giờ — tạo ra một cửa sổ rủi ro nhất định. Giải pháp tiêu chuẩn là thêm một tầng Redis blocklist: (1) mỗi JWT thêm trường jti (JWT ID) duy nhất và iat (issued-at); (2) khi user đổi password, lưu users.password_changed_at vào DB; (3) middleware kiểm tra mỗi request: nếu token.iat &lt; user.password_changed_at thì reject. Cách này không yêu cầu truy vấn Redis nếu password_changed_at được cache trong JWT của session tiếp theo. Trong scope đồ án, lựa chọn JWT 24 giờ + dependency require_staff_in_tenant đọc lại is_active mỗi request đã giảm bề mặt rủi ro xuống mức chấp nhận được, nhưng đây vẫn là điểm cần hoàn thiện trước khi triển khai sản xuất quy mô lớn.</w:t>
       </w:r>
     </w:p>
     <w:p>

</xml_diff>

<commit_message>
docs(bao-cao): bổ sung kiến trúc triển khai + sửa cơ chế chống race + bỏ P95 ảo
- Thêm mục 3.5 KIẾN TRÚC TRIỂN KHAI với sơ đồ deployment đầy đủ:
  Browser desktop/mobile, Cloudflare Edge tách riêng cloudflared,
  4 subdomain routing, Docker network, volume pg_data, SMTP external,
  annotation X-Forwarded-For + TLS termination.
- Viết lại 1.2.2, 2.3.3, 4.3.1: gọi đúng tên cơ chế chống race là
  Optimistic Concurrency Control via DB Constraint (atomic UPDATE WHERE
  + RETURNING). CHECK constraint là defense-in-depth, không phải cơ chế
  chống race chính.
- 4.2: bỏ con số P95 120-280ms không đo, thay bằng EXPLAIN ANALYZE evidence
  (DB layer < 1ms) + thừa nhận load test HTTP P95 chưa thực hiện, hẹn
  giai đoạn luận văn.
</commit_message>
<xml_diff>
--- a/bao-cao/bao-cao-mvp.docx
+++ b/bao-cao/bao-cao-mvp.docx
@@ -629,7 +629,7 @@
           <w:rFonts w:ascii="Times New Roman" w:hAnsi="Times New Roman" w:cs="Times New Roman" w:eastAsia="Times New Roman"/>
           <w:sz w:val="26"/>
         </w:rPr>
-        <w:t>Điểm của khách hàng trong hệ thống này là toàn cục — tích điểm tại Cafe Cộng và đổi quà tại Lala Food dùng cùng một ví điểm. Thiết kế này đặt ra yêu cầu về tính nhất quán: khi đổi quà, hệ thống phải kiểm tra số dư trước khi trừ, và phải đảm bảo không có cách nào đưa số dư về âm dù có request đồng thời. Đề tài áp dụng ba lớp bảo vệ: kiểm tra số dư ở tầng service trước khi thực hiện giao dịch, ràng buộc CHECK points_balance &gt;= 0 ở cấp cơ sở dữ liệu để chặn cứng bất kỳ UPDATE nào vi phạm, và cập nhật số dư trong cùng một transaction database để tránh race condition.</w:t>
+        <w:t>Điểm của khách hàng trong hệ thống này là toàn cục — tích điểm tại Cafe Cộng và đổi quà tại Lala Food dùng cùng một ví điểm. Thiết kế này đặt ra yêu cầu về tính nhất quán: khi đổi quà, hệ thống phải đảm bảo không có cách nào đưa số dư về âm dù có hai request đổi quà song song trên cùng một tài khoản. Cơ chế chính chống race condition là Optimistic Concurrency Control dựa trên database constraint: thay vì SELECT số dư rồi UPDATE (pattern dễ bị lost-update ở mức isolation READ COMMITTED), đề tài thực hiện một câu lệnh atomic duy nhất UPDATE users SET points_balance = points_balance - X WHERE id = U AND points_balance &gt;= X RETURNING points_balance. Mệnh đề WHERE points_balance &gt;= X là điểm mấu chốt: với hai request song song cùng đổi 80 điểm từ số dư 100, request đến trước commit thành công đưa số dư về 20; request đến sau khi đụng row-level lock đợi commit của request trước, sau đó so điều kiện WHERE với giá trị đã cập nhật (20 &lt; 80) nên rowcount = 0 và không UPDATE row nào. Service kiểm tra RETURNING trả None thì raise InsufficientPointsError, route map sang HTTP 400 'không đủ điểm'. Lớp thứ hai là CHECK constraint points_balance &gt;= 0 ở cấp cơ sở dữ liệu, đóng vai trò defense-in-depth cho mọi đường ghi khác (admin SQL trực tiếp, script manual fix, hoặc bug code mới trong tương lai) không đi qua pattern atomic UPDATE WHERE — nhưng trong luồng đổi quà thông thường thì CHECK không bao giờ kích hoạt vì WHERE đã loại trước.</w:t>
       </w:r>
     </w:p>
     <w:p>
@@ -3511,7 +3511,7 @@
           <w:rFonts w:ascii="Times New Roman" w:hAnsi="Times New Roman" w:cs="Times New Roman" w:eastAsia="Times New Roman"/>
           <w:sz w:val="26"/>
         </w:rPr>
-        <w:t>Thay vì lưu số dư điểm duy nhất và cập nhật theo từng giao dịch, hệ thống duy trì cả hai: cột points_balance trên bảng users (để truy vấn nhanh số dư hiện tại) và bảng point_ledger append-only (để kiểm toán toàn bộ lịch sử). Mỗi khi điểm thay đổi, hệ thống thực hiện trong cùng một database transaction: cập nhật users.points_balance và INSERT một bản ghi mới vào point_ledger với delta, reason, ref_type, ref_id và balance_after. Trigger PostgreSQL no_update_or_delete_point_ledger được kích hoạt khi có lệnh UPDATE hoặc DELETE trên bảng point_ledger và tự động raise exception, ngăn mọi hành vi sửa lịch sử sau khi đã ghi.</w:t>
+        <w:t>Thay vì lưu số dư điểm duy nhất và cập nhật theo từng giao dịch, hệ thống duy trì cả hai: cột points_balance trên bảng users (để truy vấn nhanh số dư hiện tại) và bảng point_ledger append-only (để kiểm toán toàn bộ lịch sử). Mỗi khi điểm thay đổi, hệ thống thực hiện trong cùng một database transaction: cập nhật users.points_balance và INSERT một bản ghi mới vào point_ledger với delta, reason, ref_type, ref_id và balance_after. Để chống race condition khi hai request đổi quà song song trên cùng một user, đề tài sử dụng pattern Optimistic Concurrency Control dựa trên database constraint thay vì SELECT FOR UPDATE thủ công: câu lệnh UPDATE users SET points_balance = points_balance - X WHERE id = U AND points_balance &gt;= X RETURNING points_balance là atomic ở cấp PostgreSQL. Mệnh đề WHERE đóng vai trò chốt chặn race — request đến sau khi đụng row-level lock đợi commit của request trước, sau đó so điều kiện với số dư đã cập nhật và rowcount = 0 nếu không đủ; service kiểm tra RETURNING trả None thì raise InsufficientPointsError (HTTP 400). Lớp defense-in-depth thứ hai là CHECK constraint points_balance &gt;= 0 ở cấp cơ sở dữ liệu, bắt mọi đường ghi khác không qua pattern atomic UPDATE WHERE — trong luồng đổi quà thông thường thì CHECK không kích hoạt vì WHERE đã loại trước. Trigger PostgreSQL no_update_or_delete_point_ledger được kích hoạt khi có lệnh UPDATE hoặc DELETE trên bảng point_ledger và tự động raise exception, ngăn mọi hành vi sửa lịch sử sau khi đã ghi.</w:t>
       </w:r>
     </w:p>
     <w:p>
@@ -9691,6 +9691,241 @@
     </w:p>
     <w:p>
       <w:pPr>
+        <w:pStyle w:val="Heading2"/>
+        <w:spacing w:line="312" w:lineRule="auto" w:after="120" w:before="240"/>
+        <w:jc w:val="left"/>
+      </w:pPr>
+      <w:r>
+        <w:rPr>
+          <w:rFonts w:ascii="Times New Roman" w:hAnsi="Times New Roman" w:cs="Times New Roman" w:eastAsia="Times New Roman"/>
+          <w:b/>
+          <w:sz w:val="30"/>
+        </w:rPr>
+        <w:t>3.5. KIẾN TRÚC TRIỂN KHAI</w:t>
+      </w:r>
+    </w:p>
+    <w:p>
+      <w:pPr>
+        <w:spacing w:line="312" w:lineRule="auto" w:after="120"/>
+        <w:ind w:firstLine="283"/>
+        <w:jc w:val="both"/>
+      </w:pPr>
+      <w:r>
+        <w:rPr>
+          <w:rFonts w:ascii="Times New Roman" w:hAnsi="Times New Roman" w:cs="Times New Roman" w:eastAsia="Times New Roman"/>
+          <w:sz w:val="26"/>
+        </w:rPr>
+        <w:t>Hệ thống được triển khai theo mô hình container hoá với năm thành phần chính giao tiếp qua mạng Docker nội bộ và một egress tunnel duy nhất ra Internet. Sơ đồ dưới đây trình bày toàn cảnh các thành phần và đường đi của request từ trình duyệt người dùng tới cơ sở dữ liệu, kèm các điểm quan trọng về bảo mật và vận hành. Mục đích trình bày là để người đọc hình dung được hạ tầng vật lý / logic đứng phía sau ứng dụng, đồng thời làm cơ sở cho phần đánh giá rủi ro ở chương 5.</w:t>
+      </w:r>
+    </w:p>
+    <w:p>
+      <w:pPr>
+        <w:jc w:val="center"/>
+      </w:pPr>
+      <w:r>
+        <w:drawing>
+          <wp:inline xmlns:a="http://schemas.openxmlformats.org/drawingml/2006/main" xmlns:pic="http://schemas.openxmlformats.org/drawingml/2006/picture">
+            <wp:extent cx="5580000" cy="3296535"/>
+            <wp:docPr id="2" name="Picture 2"/>
+            <wp:cNvGraphicFramePr>
+              <a:graphicFrameLocks noChangeAspect="1"/>
+            </wp:cNvGraphicFramePr>
+            <a:graphic>
+              <a:graphicData uri="http://schemas.openxmlformats.org/drawingml/2006/picture">
+                <pic:pic>
+                  <pic:nvPicPr>
+                    <pic:cNvPr id="0" name="deployment.png"/>
+                    <pic:cNvPicPr/>
+                  </pic:nvPicPr>
+                  <pic:blipFill>
+                    <a:blip r:embed="rId30"/>
+                    <a:stretch>
+                      <a:fillRect/>
+                    </a:stretch>
+                  </pic:blipFill>
+                  <pic:spPr>
+                    <a:xfrm>
+                      <a:off x="0" y="0"/>
+                      <a:ext cx="5580000" cy="3296535"/>
+                    </a:xfrm>
+                    <a:prstGeom prst="rect"/>
+                  </pic:spPr>
+                </pic:pic>
+              </a:graphicData>
+            </a:graphic>
+          </wp:inline>
+        </w:drawing>
+      </w:r>
+    </w:p>
+    <w:p>
+      <w:pPr>
+        <w:pStyle w:val="Caption"/>
+        <w:jc w:val="center"/>
+      </w:pPr>
+      <w:r>
+        <w:rPr>
+          <w:rFonts w:ascii="Times New Roman" w:hAnsi="Times New Roman" w:cs="Times New Roman" w:eastAsia="Times New Roman"/>
+          <w:b/>
+          <w:i/>
+          <w:sz w:val="24"/>
+          <w:u w:val="single"/>
+        </w:rPr>
+        <w:t xml:space="preserve">Hình 3-11: </w:t>
+      </w:r>
+      <w:r>
+        <w:rPr>
+          <w:rFonts w:ascii="Times New Roman" w:hAnsi="Times New Roman" w:cs="Times New Roman" w:eastAsia="Times New Roman"/>
+          <w:i/>
+          <w:sz w:val="24"/>
+        </w:rPr>
+        <w:t>Sơ đồ kiến trúc triển khai — Cloudflare Edge → cloudflared → Docker network → 3 container nghiệp vụ.</w:t>
+      </w:r>
+    </w:p>
+    <w:p>
+      <w:pPr>
+        <w:pStyle w:val="Heading3"/>
+        <w:spacing w:line="312" w:lineRule="auto" w:after="80" w:before="160"/>
+        <w:jc w:val="left"/>
+      </w:pPr>
+      <w:r>
+        <w:rPr>
+          <w:rFonts w:ascii="Times New Roman" w:hAnsi="Times New Roman" w:cs="Times New Roman" w:eastAsia="Times New Roman"/>
+          <w:b/>
+          <w:sz w:val="28"/>
+        </w:rPr>
+        <w:t>3.5.1. Cloudflare Edge và cloudflared (hai thành phần khác nhau)</w:t>
+      </w:r>
+    </w:p>
+    <w:p>
+      <w:pPr>
+        <w:spacing w:line="312" w:lineRule="auto" w:after="120"/>
+        <w:ind w:firstLine="283"/>
+        <w:jc w:val="both"/>
+      </w:pPr>
+      <w:r>
+        <w:rPr>
+          <w:rFonts w:ascii="Times New Roman" w:hAnsi="Times New Roman" w:cs="Times New Roman" w:eastAsia="Times New Roman"/>
+          <w:sz w:val="26"/>
+        </w:rPr>
+        <w:t>Cloudflare Edge là tầng dịch vụ chạy trên hạ tầng toàn cầu của Cloudflare (cloud-side), đảm nhiệm bốn việc: (i) kết thúc TLS (TLS termination) — chứng chỉ HTTPS được Cloudflare quản lý tự động, ứng dụng không cần xử lý chứng chỉ; (ii) chống DDoS và lọc WAF; (iii) inject header X-Forwarded-For chứa IP thật của client trước khi forward request xuống backend — đây là nguồn duy nhất để slowapi tính rate limit theo IP (mục 4.3.5); và (iv) định tuyến bốn subdomain (member.ecom-bill.com, merchant.ecom-bill.com, admin.ecom-bill.com, pos.ecom-bill.com) đều cùng đi tới một service frontend duy nhất qua tunnel.</w:t>
+      </w:r>
+    </w:p>
+    <w:p>
+      <w:pPr>
+        <w:spacing w:line="312" w:lineRule="auto" w:after="120"/>
+        <w:ind w:firstLine="283"/>
+        <w:jc w:val="both"/>
+      </w:pPr>
+      <w:r>
+        <w:rPr>
+          <w:rFonts w:ascii="Times New Roman" w:hAnsi="Times New Roman" w:cs="Times New Roman" w:eastAsia="Times New Roman"/>
+          <w:sz w:val="26"/>
+        </w:rPr>
+        <w:t>cloudflared là daemon chạy bên trong Docker host (host-side), có tên container loyalty-cloudflared. Nó duy trì kết nối egress (outbound) từ host ra Cloudflare Edge và lắng nghe request được Edge đẩy xuống. Một đặc điểm quan trọng: tunnel my-tunnel của đề tài đang ở chế độ remotely-managed — toàn bộ cấu hình ingress (subdomain → service nội bộ nào) được quản lý tại Cloudflare Edge, không phải bằng file config.yml local. Hệ quả vận hành là bất kỳ thay đổi routing nào (thêm subdomain, đổi target service) đều phải thực hiện qua Cloudflare API hoặc Zero Trust dashboard.</w:t>
+      </w:r>
+    </w:p>
+    <w:p>
+      <w:pPr>
+        <w:pStyle w:val="Heading3"/>
+        <w:spacing w:line="312" w:lineRule="auto" w:after="80" w:before="160"/>
+        <w:jc w:val="left"/>
+      </w:pPr>
+      <w:r>
+        <w:rPr>
+          <w:rFonts w:ascii="Times New Roman" w:hAnsi="Times New Roman" w:cs="Times New Roman" w:eastAsia="Times New Roman"/>
+          <w:b/>
+          <w:sz w:val="28"/>
+        </w:rPr>
+        <w:t>3.5.2. Mạng Docker nội bộ và ba container nghiệp vụ</w:t>
+      </w:r>
+    </w:p>
+    <w:p>
+      <w:pPr>
+        <w:spacing w:line="312" w:lineRule="auto" w:after="120"/>
+        <w:ind w:firstLine="283"/>
+        <w:jc w:val="both"/>
+      </w:pPr>
+      <w:r>
+        <w:rPr>
+          <w:rFonts w:ascii="Times New Roman" w:hAnsi="Times New Roman" w:cs="Times New Roman" w:eastAsia="Times New Roman"/>
+          <w:sz w:val="26"/>
+        </w:rPr>
+        <w:t>Frontend, backend và postgres đều nằm trong cùng một mạng Docker do compose tạo ra (loyalty-net). Các container giao tiếp với nhau qua DNS service-name nội bộ (frontend, backend, postgres) và không bind port ra host máy thật — chỉ cloudflared có đường ra Internet, giúp giảm bề mặt tấn công đáng kể.</w:t>
+      </w:r>
+    </w:p>
+    <w:p>
+      <w:pPr>
+        <w:spacing w:line="312" w:lineRule="auto" w:after="120"/>
+        <w:ind w:firstLine="283"/>
+        <w:jc w:val="both"/>
+      </w:pPr>
+      <w:r>
+        <w:rPr>
+          <w:rFonts w:ascii="Times New Roman" w:hAnsi="Times New Roman" w:cs="Times New Roman" w:eastAsia="Times New Roman"/>
+          <w:sz w:val="26"/>
+        </w:rPr>
+        <w:t>loyalty-frontend-prod chạy Next.js 14 ở chế độ SSR (output: standalone) trên Node 20, lắng nghe cổng 3000 nội bộ. Frontend đảm nhiệm hai vai trò: render server-side các trang App Router và đóng vai trò reverse proxy — quy tắc rewrite trong next.config.mjs ánh xạ /api/:path* tới http://backend:8000/:path* qua mạng Docker nội bộ. Nhờ cách này, browser không cần biết URL của backend; mọi request đều đi qua frontend trên cùng origin, tránh các vấn đề CORS phức tạp.</w:t>
+      </w:r>
+    </w:p>
+    <w:p>
+      <w:pPr>
+        <w:spacing w:line="312" w:lineRule="auto" w:after="120"/>
+        <w:ind w:firstLine="283"/>
+        <w:jc w:val="both"/>
+      </w:pPr>
+      <w:r>
+        <w:rPr>
+          <w:rFonts w:ascii="Times New Roman" w:hAnsi="Times New Roman" w:cs="Times New Roman" w:eastAsia="Times New Roman"/>
+          <w:sz w:val="26"/>
+        </w:rPr>
+        <w:t>loyalty-backend-prod chạy FastAPI + uvicorn (async). Khi container khởi động, entrypoint thực thi alembic upgrade head để đồng bộ migration trước khi bật uvicorn — đảm bảo schema database luôn khớp với code đang chạy. Backend cũng host APScheduler cho các job định kỳ và dùng slowapi làm middleware rate limit, key theo header X-Forwarded-For do Cloudflare Edge inject.</w:t>
+      </w:r>
+    </w:p>
+    <w:p>
+      <w:pPr>
+        <w:spacing w:line="312" w:lineRule="auto" w:after="120"/>
+        <w:ind w:firstLine="283"/>
+        <w:jc w:val="both"/>
+      </w:pPr>
+      <w:r>
+        <w:rPr>
+          <w:rFonts w:ascii="Times New Roman" w:hAnsi="Times New Roman" w:cs="Times New Roman" w:eastAsia="Times New Roman"/>
+          <w:sz w:val="26"/>
+        </w:rPr>
+        <w:t>loyalty-postgres-prod chạy PostgreSQL 15 với volume pg_data mount vào /var/lib/postgresql/data. Volume này persistent — tồn tại ngay cả khi container bị xóa và tạo lại — đảm bảo dữ liệu không mất khi deploy hay khi server khởi động lại. Backup hiện được thực hiện thủ công bằng pg_dump theo lịch (đề tài thừa nhận đây là hạn chế và đề xuất tự động hóa trong giai đoạn luận văn — xem mục 5.3).</w:t>
+      </w:r>
+    </w:p>
+    <w:p>
+      <w:pPr>
+        <w:pStyle w:val="Heading3"/>
+        <w:spacing w:line="312" w:lineRule="auto" w:after="80" w:before="160"/>
+        <w:jc w:val="left"/>
+      </w:pPr>
+      <w:r>
+        <w:rPr>
+          <w:rFonts w:ascii="Times New Roman" w:hAnsi="Times New Roman" w:cs="Times New Roman" w:eastAsia="Times New Roman"/>
+          <w:b/>
+          <w:sz w:val="28"/>
+        </w:rPr>
+        <w:t>3.5.3. SMTP ngoài và luồng quên mật khẩu</w:t>
+      </w:r>
+    </w:p>
+    <w:p>
+      <w:pPr>
+        <w:spacing w:line="312" w:lineRule="auto" w:after="120"/>
+        <w:ind w:firstLine="283"/>
+        <w:jc w:val="both"/>
+      </w:pPr>
+      <w:r>
+        <w:rPr>
+          <w:rFonts w:ascii="Times New Roman" w:hAnsi="Times New Roman" w:cs="Times New Roman" w:eastAsia="Times New Roman"/>
+          <w:sz w:val="26"/>
+        </w:rPr>
+        <w:t>Backend kết nối tới một SMTP server bên ngoài (mặc định smtp.gmail.com:587 với STARTTLS) qua thư viện aiosmtplib khi xử lý luồng quên mật khẩu. Đây là kết nối optional — nếu SMTP server timeout hay từ chối kết nối, backend áp dụng cơ chế fail-silent: trả HTTP 200 với thông điệp trung lập cho client và chỉ ghi log WARNING tại docker logs. Chi tiết phân tích bảo mật của hành vi fail-silent này nằm ở mục 4.3.4.</w:t>
+      </w:r>
+    </w:p>
+    <w:p>
+      <w:pPr>
         <w:sectPr>
           <w:headerReference w:type="default" r:id="rId25"/>
           <w:footerReference w:type="default" r:id="rId26"/>
@@ -13887,7 +14122,21 @@
           <w:rFonts w:ascii="Times New Roman" w:hAnsi="Times New Roman" w:cs="Times New Roman" w:eastAsia="Times New Roman"/>
           <w:sz w:val="26"/>
         </w:rPr>
-        <w:t>Về hiệu năng, đề tài thực hiện một số kiểm tra cơ bản trên production URL. Rate limit slowapi hoạt động đúng: gửi liên tục hơn 30 request login/phút từ cùng IP nhận được HTTP 429. Thời gian phản hồi P95 của các endpoint thường dùng (GET /partners, POST /transactions) dao động trong khoảng 120–280ms trên môi trường production với Cloudflare Tunnel, đủ để đảm bảo trải nghiệm người dùng tốt trong điều kiện thực tế.</w:t>
+        <w:t>Về hiệu năng, đề tài thực hiện kiểm tra ở mức cơ sở dữ liệu thay vì đo P95 HTTP toàn tuyến. Cụ thể, tác giả chạy EXPLAIN (ANALYZE, BUFFERS) trên các truy vấn chính trong môi trường production (PostgreSQL 15, dataset demo 17 users, 65 transactions, 8 partners) bao gồm: lookup user theo email cho login, kiểm tra membership (user, partner), list transaction theo partner sắp xếp theo thời gian, aggregate dashboard tổng số giao dịch trong ngày, và history ledger theo user. Kết quả cả năm truy vấn đều có thời gian thực thi dưới 1 ms nhờ index B-tree đã đặt ở các cột scope (partner_id, user_id, created_at) và unique constraint trên email/phone — kế hoạch thực thi sử dụng Index Scan, không có Seq Scan trên bảng nghiệp vụ chính. Đồng thời, tác giả xác nhận các cơ chế vận hành: rate limit slowapi hoạt động đúng (gửi liên tục hơn 30 request login/phút từ cùng IP nhận HTTP 429), trigger no_update_or_delete_point_ledger raise exception khi thử UPDATE/DELETE trực tiếp qua psql, và Cloudflare Tunnel ổn định trong nhiều ngày liên tục với cloudflared remotely-managed.</w:t>
+      </w:r>
+    </w:p>
+    <w:p>
+      <w:pPr>
+        <w:spacing w:line="312" w:lineRule="auto" w:after="120"/>
+        <w:ind w:firstLine="283"/>
+        <w:jc w:val="both"/>
+      </w:pPr>
+      <w:r>
+        <w:rPr>
+          <w:rFonts w:ascii="Times New Roman" w:hAnsi="Times New Roman" w:cs="Times New Roman" w:eastAsia="Times New Roman"/>
+          <w:sz w:val="26"/>
+        </w:rPr>
+        <w:t>Về kiểm thử tải HTTP — đo P50/P95/P99, RPS dưới tải đồng thời với công cụ chuyên dụng như k6, wrk hoặc Apache Bench — đề tài thừa nhận chưa thực hiện trong phạm vi đồ án thực tập. Lý do là khối lượng triển khai 8 phase MVP (xem mục 4.1) đã chiếm phần lớn thời gian, và việc dựng kịch bản load test có ý nghĩa (mô hình tải đại diện, dataset đủ lớn, isolation môi trường, đo nhiều lần để có phân phối tin cậy) đòi hỏi quy trình bài bản hơn mức một con số P95 đơn lẻ có thể truyền tải. Đây là một trong những hạn chế đã ghi nhận và là phần công việc dự kiến bổ sung trong giai đoạn luận văn tốt nghiệp, khi tác giả có thể đầu tư đúng mức cho thiết kế thử nghiệm và phân tích hiệu năng cấp hệ thống (xem mục 5.3).</w:t>
       </w:r>
     </w:p>
     <w:p>
@@ -13931,7 +14180,7 @@
           <w:rFonts w:ascii="Times New Roman" w:hAnsi="Times New Roman" w:cs="Times New Roman" w:eastAsia="Times New Roman"/>
           <w:sz w:val="26"/>
         </w:rPr>
-        <w:t>Đảm bảo số dư điểm không bao giờ về âm là một trong những ràng buộc quan trọng nhất của hệ thống. Đề tài triển khai ba lớp bảo vệ phối hợp để chắc chắn ràng buộc này không bị phá vỡ ở bất kỳ tình huống nào. Lớp thứ nhất là validation ở tầng Pydantic: schema yêu cầu amount &gt; 0 cho mọi request trừ điểm, loại bỏ các input không hợp lệ ngay tại cổng vào API. Lớp thứ hai là kiểm tra số dư trong service trước khi thực hiện bất kỳ thao tác trừ điểm nào — service đọc points_balance hiện tại và so sánh với số điểm cần trừ, raise exception nếu không đủ. Lớp thứ ba là CHECK constraint points_balance_nonneg trực tiếp trên bảng users trong PostgreSQL — dù có bug ở hai lớp trên, database vẫn từ chối bất kỳ UPDATE nào đưa giá trị về âm và raise IntegrityError.</w:t>
+        <w:t>Đảm bảo số dư điểm không bao giờ về âm là một trong những ràng buộc quan trọng nhất của hệ thống. Khó khăn cốt lõi là race condition: với mức isolation mặc định READ COMMITTED của PostgreSQL, hai request đổi quà song song trên cùng tài khoản có thể đều SELECT thấy số dư đủ rồi cả hai cùng UPDATE — pattern SELECT-then-UPDATE là dạng lost-update kinh điển. Đề tài triển khai ba lớp bảo vệ với mục đích và thứ tự logic rõ ràng. Lớp thứ nhất là validation ở tầng Pydantic schema: yêu cầu amount &gt; 0 cho mọi request trừ điểm để loại input không hợp lệ ngay tại cổng vào, đồng thời service kiểm tra điểm trước khi thực hiện transaction để trả về thông báo lỗi rõ ràng cho UX (HTTP 400 'không đủ điểm') — đây là pre-check phục vụ trải nghiệm, không phải cơ chế chống race. Lớp thứ hai — và là cơ chế chống race chính — là pattern Optimistic Concurrency Control dựa trên database constraint: cả ba đường ghi points_balance trong hệ thống (tích điểm POS ở transaction_service, đổi quà ở redemption_service, điều chỉnh thủ công ở members API) đều dùng câu lệnh atomic UPDATE users SET points_balance = ... WHERE id = U AND &lt;điều_kiện_không_âm&gt; RETURNING points_balance thay vì SELECT-then-UPDATE. Trong luồng đổi quà, mệnh đề WHERE points_balance &gt;= cost là chốt chặn race: hai request song song cùng đổi 80 từ số dư 100 sẽ được PostgreSQL serialize qua row-level lock, request đến sau so điều kiện với số dư đã cập nhật (20 &lt; 80) nên rowcount = 0 và RETURNING trả None, service raise InsufficientPointsError. Lớp thứ ba là CHECK constraint points_balance_nonneg ở cấp PostgreSQL, đóng vai trò failsafe defense-in-depth bắt mọi đường UPDATE khác KHÔNG đi qua pattern atomic UPDATE WHERE — ví dụ admin chạy SQL trực tiếp, script manual fix, hoặc bug code mới được thêm trong tương lai bỏ quên mệnh đề WHERE. Trong luồng đổi quà bình thường thì CHECK không bao giờ kích hoạt vì WHERE đã loại trước; nhưng nó là tuyến phòng thủ cuối cùng đảm bảo ngay cả khi cơ chế chính bị bypass thì invariant points_balance &gt;= 0 vẫn được giữ ở mức database.</w:t>
       </w:r>
     </w:p>
     <w:p>
@@ -14053,10 +14302,10 @@
     <w:p>
       <w:pPr>
         <w:sectPr>
-          <w:headerReference w:type="default" r:id="rId30"/>
-          <w:footerReference w:type="default" r:id="rId31"/>
-          <w:headerReference w:type="first" r:id="rId32"/>
-          <w:footerReference w:type="first" r:id="rId33"/>
+          <w:headerReference w:type="default" r:id="rId31"/>
+          <w:footerReference w:type="default" r:id="rId32"/>
+          <w:headerReference w:type="first" r:id="rId33"/>
+          <w:footerReference w:type="first" r:id="rId34"/>
           <w:pgSz w:w="12240" w:h="15840"/>
           <w:pgMar w:top="1134" w:right="1134" w:bottom="1134" w:left="1701" w:header="720" w:footer="720" w:gutter="0"/>
           <w:cols w:space="720"/>
@@ -15175,10 +15424,10 @@
     <w:p>
       <w:pPr>
         <w:sectPr>
-          <w:headerReference w:type="default" r:id="rId34"/>
-          <w:footerReference w:type="default" r:id="rId35"/>
-          <w:headerReference w:type="first" r:id="rId36"/>
-          <w:footerReference w:type="first" r:id="rId37"/>
+          <w:headerReference w:type="default" r:id="rId35"/>
+          <w:footerReference w:type="default" r:id="rId36"/>
+          <w:headerReference w:type="first" r:id="rId37"/>
+          <w:footerReference w:type="first" r:id="rId38"/>
           <w:pgSz w:w="12240" w:h="15840"/>
           <w:pgMar w:top="1134" w:right="1134" w:bottom="1134" w:left="1701" w:header="720" w:footer="720" w:gutter="0"/>
           <w:cols w:space="720"/>
@@ -15812,10 +16061,10 @@
     <w:p>
       <w:pPr>
         <w:sectPr>
-          <w:headerReference w:type="default" r:id="rId38"/>
-          <w:footerReference w:type="default" r:id="rId39"/>
-          <w:headerReference w:type="first" r:id="rId40"/>
-          <w:footerReference w:type="first" r:id="rId41"/>
+          <w:headerReference w:type="default" r:id="rId39"/>
+          <w:footerReference w:type="default" r:id="rId40"/>
+          <w:headerReference w:type="first" r:id="rId41"/>
+          <w:footerReference w:type="first" r:id="rId42"/>
           <w:pgSz w:w="12240" w:h="15840"/>
           <w:pgMar w:top="1134" w:right="1134" w:bottom="1134" w:left="1701" w:header="720" w:footer="720" w:gutter="0"/>
           <w:cols w:space="720"/>
@@ -16021,10 +16270,10 @@
       </w:r>
     </w:p>
     <w:sectPr>
-      <w:headerReference w:type="default" r:id="rId42"/>
-      <w:footerReference w:type="default" r:id="rId43"/>
-      <w:headerReference w:type="first" r:id="rId44"/>
-      <w:footerReference w:type="first" r:id="rId45"/>
+      <w:headerReference w:type="default" r:id="rId43"/>
+      <w:footerReference w:type="default" r:id="rId44"/>
+      <w:headerReference w:type="first" r:id="rId45"/>
+      <w:footerReference w:type="first" r:id="rId46"/>
       <w:pgSz w:w="12240" w:h="15840"/>
       <w:pgMar w:top="1134" w:right="1134" w:bottom="1134" w:left="1701" w:header="720" w:footer="720" w:gutter="0"/>
       <w:cols w:space="720"/>

</xml_diff>

<commit_message>
docs(bao-cao): bổ sung 5 sơ đồ UML — 3 sequence + 2 activity
- seq-login.png: tuần tự đăng nhập JWT (User→Frontend→Backend→AuthService→DB)
- seq-pos-earn.png: tuần tự POS tích điểm (3 DB ops trong cùng transaction)
- seq-redeem.png: tuần tự đổi quà (UPDATE…WHERE balance≥cost atomic check-and-write)
- act-merchant-register.png: hoạt động đăng ký + duyệt merchant (3 swimlane)
- act-forgot-password.png: hoạt động quên mật khẩu fail-silent (3 nhánh hội tụ HTTP 200)

Vẽ bằng matplotlib để đồng bộ style với erd.png + deployment.png.
</commit_message>
<xml_diff>
--- a/bao-cao/bao-cao-mvp.docx
+++ b/bao-cao/bao-cao-mvp.docx
@@ -7504,12 +7504,38 @@
         <w:jc w:val="center"/>
       </w:pPr>
       <w:r>
-        <w:rPr>
-          <w:rFonts w:ascii="Times New Roman" w:hAnsi="Times New Roman" w:cs="Times New Roman" w:eastAsia="Times New Roman"/>
-          <w:i/>
-          <w:sz w:val="26"/>
-        </w:rPr>
-        <w:t>[HÌNH MISSING: D:\DoAn\bao-cao\assets\diagrams\seq-login.png]</w:t>
+        <w:drawing>
+          <wp:inline xmlns:a="http://schemas.openxmlformats.org/drawingml/2006/main" xmlns:pic="http://schemas.openxmlformats.org/drawingml/2006/picture">
+            <wp:extent cx="5040000" cy="3308041"/>
+            <wp:docPr id="2" name="Picture 2"/>
+            <wp:cNvGraphicFramePr>
+              <a:graphicFrameLocks noChangeAspect="1"/>
+            </wp:cNvGraphicFramePr>
+            <a:graphic>
+              <a:graphicData uri="http://schemas.openxmlformats.org/drawingml/2006/picture">
+                <pic:pic>
+                  <pic:nvPicPr>
+                    <pic:cNvPr id="0" name="seq-login.png"/>
+                    <pic:cNvPicPr/>
+                  </pic:nvPicPr>
+                  <pic:blipFill>
+                    <a:blip r:embed="rId30"/>
+                    <a:stretch>
+                      <a:fillRect/>
+                    </a:stretch>
+                  </pic:blipFill>
+                  <pic:spPr>
+                    <a:xfrm>
+                      <a:off x="0" y="0"/>
+                      <a:ext cx="5040000" cy="3308041"/>
+                    </a:xfrm>
+                    <a:prstGeom prst="rect"/>
+                  </pic:spPr>
+                </pic:pic>
+              </a:graphicData>
+            </a:graphic>
+          </wp:inline>
+        </w:drawing>
       </w:r>
     </w:p>
     <w:p>
@@ -7555,12 +7581,38 @@
         <w:jc w:val="center"/>
       </w:pPr>
       <w:r>
-        <w:rPr>
-          <w:rFonts w:ascii="Times New Roman" w:hAnsi="Times New Roman" w:cs="Times New Roman" w:eastAsia="Times New Roman"/>
-          <w:i/>
-          <w:sz w:val="26"/>
-        </w:rPr>
-        <w:t>[HÌNH MISSING: D:\DoAn\bao-cao\assets\diagrams\seq-pos-earn.png]</w:t>
+        <w:drawing>
+          <wp:inline xmlns:a="http://schemas.openxmlformats.org/drawingml/2006/main" xmlns:pic="http://schemas.openxmlformats.org/drawingml/2006/picture">
+            <wp:extent cx="5040000" cy="3086650"/>
+            <wp:docPr id="3" name="Picture 3"/>
+            <wp:cNvGraphicFramePr>
+              <a:graphicFrameLocks noChangeAspect="1"/>
+            </wp:cNvGraphicFramePr>
+            <a:graphic>
+              <a:graphicData uri="http://schemas.openxmlformats.org/drawingml/2006/picture">
+                <pic:pic>
+                  <pic:nvPicPr>
+                    <pic:cNvPr id="0" name="seq-pos-earn.png"/>
+                    <pic:cNvPicPr/>
+                  </pic:nvPicPr>
+                  <pic:blipFill>
+                    <a:blip r:embed="rId31"/>
+                    <a:stretch>
+                      <a:fillRect/>
+                    </a:stretch>
+                  </pic:blipFill>
+                  <pic:spPr>
+                    <a:xfrm>
+                      <a:off x="0" y="0"/>
+                      <a:ext cx="5040000" cy="3086650"/>
+                    </a:xfrm>
+                    <a:prstGeom prst="rect"/>
+                  </pic:spPr>
+                </pic:pic>
+              </a:graphicData>
+            </a:graphic>
+          </wp:inline>
+        </w:drawing>
       </w:r>
     </w:p>
     <w:p>
@@ -7606,12 +7658,38 @@
         <w:jc w:val="center"/>
       </w:pPr>
       <w:r>
-        <w:rPr>
-          <w:rFonts w:ascii="Times New Roman" w:hAnsi="Times New Roman" w:cs="Times New Roman" w:eastAsia="Times New Roman"/>
-          <w:i/>
-          <w:sz w:val="26"/>
-        </w:rPr>
-        <w:t>[HÌNH MISSING: D:\DoAn\bao-cao\assets\diagrams\seq-redeem.png]</w:t>
+        <w:drawing>
+          <wp:inline xmlns:a="http://schemas.openxmlformats.org/drawingml/2006/main" xmlns:pic="http://schemas.openxmlformats.org/drawingml/2006/picture">
+            <wp:extent cx="5040000" cy="3277082"/>
+            <wp:docPr id="4" name="Picture 4"/>
+            <wp:cNvGraphicFramePr>
+              <a:graphicFrameLocks noChangeAspect="1"/>
+            </wp:cNvGraphicFramePr>
+            <a:graphic>
+              <a:graphicData uri="http://schemas.openxmlformats.org/drawingml/2006/picture">
+                <pic:pic>
+                  <pic:nvPicPr>
+                    <pic:cNvPr id="0" name="seq-redeem.png"/>
+                    <pic:cNvPicPr/>
+                  </pic:nvPicPr>
+                  <pic:blipFill>
+                    <a:blip r:embed="rId32"/>
+                    <a:stretch>
+                      <a:fillRect/>
+                    </a:stretch>
+                  </pic:blipFill>
+                  <pic:spPr>
+                    <a:xfrm>
+                      <a:off x="0" y="0"/>
+                      <a:ext cx="5040000" cy="3277082"/>
+                    </a:xfrm>
+                    <a:prstGeom prst="rect"/>
+                  </pic:spPr>
+                </pic:pic>
+              </a:graphicData>
+            </a:graphic>
+          </wp:inline>
+        </w:drawing>
       </w:r>
     </w:p>
     <w:p>
@@ -7686,12 +7764,38 @@
         <w:jc w:val="center"/>
       </w:pPr>
       <w:r>
-        <w:rPr>
-          <w:rFonts w:ascii="Times New Roman" w:hAnsi="Times New Roman" w:cs="Times New Roman" w:eastAsia="Times New Roman"/>
-          <w:i/>
-          <w:sz w:val="26"/>
-        </w:rPr>
-        <w:t>[HÌNH MISSING: D:\DoAn\bao-cao\assets\diagrams\act-merchant-register.png]</w:t>
+        <w:drawing>
+          <wp:inline xmlns:a="http://schemas.openxmlformats.org/drawingml/2006/main" xmlns:pic="http://schemas.openxmlformats.org/drawingml/2006/picture">
+            <wp:extent cx="5040000" cy="5006015"/>
+            <wp:docPr id="5" name="Picture 5"/>
+            <wp:cNvGraphicFramePr>
+              <a:graphicFrameLocks noChangeAspect="1"/>
+            </wp:cNvGraphicFramePr>
+            <a:graphic>
+              <a:graphicData uri="http://schemas.openxmlformats.org/drawingml/2006/picture">
+                <pic:pic>
+                  <pic:nvPicPr>
+                    <pic:cNvPr id="0" name="act-merchant-register.png"/>
+                    <pic:cNvPicPr/>
+                  </pic:nvPicPr>
+                  <pic:blipFill>
+                    <a:blip r:embed="rId33"/>
+                    <a:stretch>
+                      <a:fillRect/>
+                    </a:stretch>
+                  </pic:blipFill>
+                  <pic:spPr>
+                    <a:xfrm>
+                      <a:off x="0" y="0"/>
+                      <a:ext cx="5040000" cy="5006015"/>
+                    </a:xfrm>
+                    <a:prstGeom prst="rect"/>
+                  </pic:spPr>
+                </pic:pic>
+              </a:graphicData>
+            </a:graphic>
+          </wp:inline>
+        </w:drawing>
       </w:r>
     </w:p>
     <w:p>
@@ -7737,12 +7841,38 @@
         <w:jc w:val="center"/>
       </w:pPr>
       <w:r>
-        <w:rPr>
-          <w:rFonts w:ascii="Times New Roman" w:hAnsi="Times New Roman" w:cs="Times New Roman" w:eastAsia="Times New Roman"/>
-          <w:i/>
-          <w:sz w:val="26"/>
-        </w:rPr>
-        <w:t>[HÌNH MISSING: D:\DoAn\bao-cao\assets\diagrams\act-forgot-password.png]</w:t>
+        <w:drawing>
+          <wp:inline xmlns:a="http://schemas.openxmlformats.org/drawingml/2006/main" xmlns:pic="http://schemas.openxmlformats.org/drawingml/2006/picture">
+            <wp:extent cx="5040000" cy="5983834"/>
+            <wp:docPr id="6" name="Picture 6"/>
+            <wp:cNvGraphicFramePr>
+              <a:graphicFrameLocks noChangeAspect="1"/>
+            </wp:cNvGraphicFramePr>
+            <a:graphic>
+              <a:graphicData uri="http://schemas.openxmlformats.org/drawingml/2006/picture">
+                <pic:pic>
+                  <pic:nvPicPr>
+                    <pic:cNvPr id="0" name="act-forgot-password.png"/>
+                    <pic:cNvPicPr/>
+                  </pic:nvPicPr>
+                  <pic:blipFill>
+                    <a:blip r:embed="rId34"/>
+                    <a:stretch>
+                      <a:fillRect/>
+                    </a:stretch>
+                  </pic:blipFill>
+                  <pic:spPr>
+                    <a:xfrm>
+                      <a:off x="0" y="0"/>
+                      <a:ext cx="5040000" cy="5983834"/>
+                    </a:xfrm>
+                    <a:prstGeom prst="rect"/>
+                  </pic:spPr>
+                </pic:pic>
+              </a:graphicData>
+            </a:graphic>
+          </wp:inline>
+        </w:drawing>
       </w:r>
     </w:p>
     <w:p>
@@ -9726,7 +9856,7 @@
         <w:drawing>
           <wp:inline xmlns:a="http://schemas.openxmlformats.org/drawingml/2006/main" xmlns:pic="http://schemas.openxmlformats.org/drawingml/2006/picture">
             <wp:extent cx="5580000" cy="3296535"/>
-            <wp:docPr id="2" name="Picture 2"/>
+            <wp:docPr id="7" name="Picture 7"/>
             <wp:cNvGraphicFramePr>
               <a:graphicFrameLocks noChangeAspect="1"/>
             </wp:cNvGraphicFramePr>
@@ -9738,7 +9868,7 @@
                     <pic:cNvPicPr/>
                   </pic:nvPicPr>
                   <pic:blipFill>
-                    <a:blip r:embed="rId30"/>
+                    <a:blip r:embed="rId35"/>
                     <a:stretch>
                       <a:fillRect/>
                     </a:stretch>
@@ -14302,10 +14432,10 @@
     <w:p>
       <w:pPr>
         <w:sectPr>
-          <w:headerReference w:type="default" r:id="rId31"/>
-          <w:footerReference w:type="default" r:id="rId32"/>
-          <w:headerReference w:type="first" r:id="rId33"/>
-          <w:footerReference w:type="first" r:id="rId34"/>
+          <w:headerReference w:type="default" r:id="rId36"/>
+          <w:footerReference w:type="default" r:id="rId37"/>
+          <w:headerReference w:type="first" r:id="rId38"/>
+          <w:footerReference w:type="first" r:id="rId39"/>
           <w:pgSz w:w="12240" w:h="15840"/>
           <w:pgMar w:top="1134" w:right="1134" w:bottom="1134" w:left="1701" w:header="720" w:footer="720" w:gutter="0"/>
           <w:cols w:space="720"/>
@@ -15424,10 +15554,10 @@
     <w:p>
       <w:pPr>
         <w:sectPr>
-          <w:headerReference w:type="default" r:id="rId35"/>
-          <w:footerReference w:type="default" r:id="rId36"/>
-          <w:headerReference w:type="first" r:id="rId37"/>
-          <w:footerReference w:type="first" r:id="rId38"/>
+          <w:headerReference w:type="default" r:id="rId40"/>
+          <w:footerReference w:type="default" r:id="rId41"/>
+          <w:headerReference w:type="first" r:id="rId42"/>
+          <w:footerReference w:type="first" r:id="rId43"/>
           <w:pgSz w:w="12240" w:h="15840"/>
           <w:pgMar w:top="1134" w:right="1134" w:bottom="1134" w:left="1701" w:header="720" w:footer="720" w:gutter="0"/>
           <w:cols w:space="720"/>
@@ -16061,10 +16191,10 @@
     <w:p>
       <w:pPr>
         <w:sectPr>
-          <w:headerReference w:type="default" r:id="rId39"/>
-          <w:footerReference w:type="default" r:id="rId40"/>
-          <w:headerReference w:type="first" r:id="rId41"/>
-          <w:footerReference w:type="first" r:id="rId42"/>
+          <w:headerReference w:type="default" r:id="rId44"/>
+          <w:footerReference w:type="default" r:id="rId45"/>
+          <w:headerReference w:type="first" r:id="rId46"/>
+          <w:footerReference w:type="first" r:id="rId47"/>
           <w:pgSz w:w="12240" w:h="15840"/>
           <w:pgMar w:top="1134" w:right="1134" w:bottom="1134" w:left="1701" w:header="720" w:footer="720" w:gutter="0"/>
           <w:cols w:space="720"/>
@@ -16270,10 +16400,10 @@
       </w:r>
     </w:p>
     <w:sectPr>
-      <w:headerReference w:type="default" r:id="rId43"/>
-      <w:footerReference w:type="default" r:id="rId44"/>
-      <w:headerReference w:type="first" r:id="rId45"/>
-      <w:footerReference w:type="first" r:id="rId46"/>
+      <w:headerReference w:type="default" r:id="rId48"/>
+      <w:footerReference w:type="default" r:id="rId49"/>
+      <w:headerReference w:type="first" r:id="rId50"/>
+      <w:footerReference w:type="first" r:id="rId51"/>
       <w:pgSz w:w="12240" w:h="15840"/>
       <w:pgMar w:top="1134" w:right="1134" w:bottom="1134" w:left="1701" w:header="720" w:footer="720" w:gutter="0"/>
       <w:cols w:space="720"/>

</xml_diff>

<commit_message>
docs(bao-cao): bổ sung 13 screenshot UI thật (mobile + desktop)
- 9 screenshot cho phụ lục hướng dẫn sử dụng (buoc-1 → buoc-9):
  register, login, member home, partner list, partner detail,
  redeem confirm, voucher list, member QR, staff verify voucher.
- 4 screenshot cho chương 3 minh hoạ giao diện 4 vai trò:
  member-home, partner-dashboard, staff-pos, admin-system-points.
- Mobile 390x844, desktop 1440x900 — chụp trực tiếp prod
  loyalty.ecom-bill.com qua Playwright MCP.
- Build lại bao-cao-mvp.docx (2.3M, +0.7M do nhúng ảnh).
</commit_message>
<xml_diff>
--- a/bao-cao/bao-cao-mvp.docx
+++ b/bao-cao/bao-cao-mvp.docx
@@ -9489,12 +9489,38 @@
         <w:jc w:val="center"/>
       </w:pPr>
       <w:r>
-        <w:rPr>
-          <w:rFonts w:ascii="Times New Roman" w:hAnsi="Times New Roman" w:cs="Times New Roman" w:eastAsia="Times New Roman"/>
-          <w:i/>
-          <w:sz w:val="26"/>
-        </w:rPr>
-        <w:t>[HÌNH MISSING: D:\DoAn\bao-cao\assets\screenshots\member-home.png]</w:t>
+        <w:drawing>
+          <wp:inline xmlns:a="http://schemas.openxmlformats.org/drawingml/2006/main" xmlns:pic="http://schemas.openxmlformats.org/drawingml/2006/picture">
+            <wp:extent cx="5040000" cy="10907077"/>
+            <wp:docPr id="7" name="Picture 7"/>
+            <wp:cNvGraphicFramePr>
+              <a:graphicFrameLocks noChangeAspect="1"/>
+            </wp:cNvGraphicFramePr>
+            <a:graphic>
+              <a:graphicData uri="http://schemas.openxmlformats.org/drawingml/2006/picture">
+                <pic:pic>
+                  <pic:nvPicPr>
+                    <pic:cNvPr id="0" name="member-home.png"/>
+                    <pic:cNvPicPr/>
+                  </pic:nvPicPr>
+                  <pic:blipFill>
+                    <a:blip r:embed="rId35"/>
+                    <a:stretch>
+                      <a:fillRect/>
+                    </a:stretch>
+                  </pic:blipFill>
+                  <pic:spPr>
+                    <a:xfrm>
+                      <a:off x="0" y="0"/>
+                      <a:ext cx="5040000" cy="10907077"/>
+                    </a:xfrm>
+                    <a:prstGeom prst="rect"/>
+                  </pic:spPr>
+                </pic:pic>
+              </a:graphicData>
+            </a:graphic>
+          </wp:inline>
+        </w:drawing>
       </w:r>
     </w:p>
     <w:p>
@@ -9526,12 +9552,38 @@
         <w:jc w:val="center"/>
       </w:pPr>
       <w:r>
-        <w:rPr>
-          <w:rFonts w:ascii="Times New Roman" w:hAnsi="Times New Roman" w:cs="Times New Roman" w:eastAsia="Times New Roman"/>
-          <w:i/>
-          <w:sz w:val="26"/>
-        </w:rPr>
-        <w:t>[HÌNH MISSING: D:\DoAn\bao-cao\assets\screenshots\partner-dashboard.png]</w:t>
+        <w:drawing>
+          <wp:inline xmlns:a="http://schemas.openxmlformats.org/drawingml/2006/main" xmlns:pic="http://schemas.openxmlformats.org/drawingml/2006/picture">
+            <wp:extent cx="5040000" cy="3150000"/>
+            <wp:docPr id="8" name="Picture 8"/>
+            <wp:cNvGraphicFramePr>
+              <a:graphicFrameLocks noChangeAspect="1"/>
+            </wp:cNvGraphicFramePr>
+            <a:graphic>
+              <a:graphicData uri="http://schemas.openxmlformats.org/drawingml/2006/picture">
+                <pic:pic>
+                  <pic:nvPicPr>
+                    <pic:cNvPr id="0" name="partner-dashboard.png"/>
+                    <pic:cNvPicPr/>
+                  </pic:nvPicPr>
+                  <pic:blipFill>
+                    <a:blip r:embed="rId36"/>
+                    <a:stretch>
+                      <a:fillRect/>
+                    </a:stretch>
+                  </pic:blipFill>
+                  <pic:spPr>
+                    <a:xfrm>
+                      <a:off x="0" y="0"/>
+                      <a:ext cx="5040000" cy="3150000"/>
+                    </a:xfrm>
+                    <a:prstGeom prst="rect"/>
+                  </pic:spPr>
+                </pic:pic>
+              </a:graphicData>
+            </a:graphic>
+          </wp:inline>
+        </w:drawing>
       </w:r>
     </w:p>
     <w:p>
@@ -9563,12 +9615,38 @@
         <w:jc w:val="center"/>
       </w:pPr>
       <w:r>
-        <w:rPr>
-          <w:rFonts w:ascii="Times New Roman" w:hAnsi="Times New Roman" w:cs="Times New Roman" w:eastAsia="Times New Roman"/>
-          <w:i/>
-          <w:sz w:val="26"/>
-        </w:rPr>
-        <w:t>[HÌNH MISSING: D:\DoAn\bao-cao\assets\screenshots\staff-pos.png]</w:t>
+        <w:drawing>
+          <wp:inline xmlns:a="http://schemas.openxmlformats.org/drawingml/2006/main" xmlns:pic="http://schemas.openxmlformats.org/drawingml/2006/picture">
+            <wp:extent cx="5040000" cy="18627840"/>
+            <wp:docPr id="9" name="Picture 9"/>
+            <wp:cNvGraphicFramePr>
+              <a:graphicFrameLocks noChangeAspect="1"/>
+            </wp:cNvGraphicFramePr>
+            <a:graphic>
+              <a:graphicData uri="http://schemas.openxmlformats.org/drawingml/2006/picture">
+                <pic:pic>
+                  <pic:nvPicPr>
+                    <pic:cNvPr id="0" name="staff-pos.png"/>
+                    <pic:cNvPicPr/>
+                  </pic:nvPicPr>
+                  <pic:blipFill>
+                    <a:blip r:embed="rId37"/>
+                    <a:stretch>
+                      <a:fillRect/>
+                    </a:stretch>
+                  </pic:blipFill>
+                  <pic:spPr>
+                    <a:xfrm>
+                      <a:off x="0" y="0"/>
+                      <a:ext cx="5040000" cy="18627840"/>
+                    </a:xfrm>
+                    <a:prstGeom prst="rect"/>
+                  </pic:spPr>
+                </pic:pic>
+              </a:graphicData>
+            </a:graphic>
+          </wp:inline>
+        </w:drawing>
       </w:r>
     </w:p>
     <w:p>
@@ -9600,12 +9678,38 @@
         <w:jc w:val="center"/>
       </w:pPr>
       <w:r>
-        <w:rPr>
-          <w:rFonts w:ascii="Times New Roman" w:hAnsi="Times New Roman" w:cs="Times New Roman" w:eastAsia="Times New Roman"/>
-          <w:i/>
-          <w:sz w:val="26"/>
-        </w:rPr>
-        <w:t>[HÌNH MISSING: D:\DoAn\bao-cao\assets\screenshots\admin-system-points.png]</w:t>
+        <w:drawing>
+          <wp:inline xmlns:a="http://schemas.openxmlformats.org/drawingml/2006/main" xmlns:pic="http://schemas.openxmlformats.org/drawingml/2006/picture">
+            <wp:extent cx="5040000" cy="3150000"/>
+            <wp:docPr id="10" name="Picture 10"/>
+            <wp:cNvGraphicFramePr>
+              <a:graphicFrameLocks noChangeAspect="1"/>
+            </wp:cNvGraphicFramePr>
+            <a:graphic>
+              <a:graphicData uri="http://schemas.openxmlformats.org/drawingml/2006/picture">
+                <pic:pic>
+                  <pic:nvPicPr>
+                    <pic:cNvPr id="0" name="admin-system-points.png"/>
+                    <pic:cNvPicPr/>
+                  </pic:nvPicPr>
+                  <pic:blipFill>
+                    <a:blip r:embed="rId38"/>
+                    <a:stretch>
+                      <a:fillRect/>
+                    </a:stretch>
+                  </pic:blipFill>
+                  <pic:spPr>
+                    <a:xfrm>
+                      <a:off x="0" y="0"/>
+                      <a:ext cx="5040000" cy="3150000"/>
+                    </a:xfrm>
+                    <a:prstGeom prst="rect"/>
+                  </pic:spPr>
+                </pic:pic>
+              </a:graphicData>
+            </a:graphic>
+          </wp:inline>
+        </w:drawing>
       </w:r>
     </w:p>
     <w:p>
@@ -9856,7 +9960,7 @@
         <w:drawing>
           <wp:inline xmlns:a="http://schemas.openxmlformats.org/drawingml/2006/main" xmlns:pic="http://schemas.openxmlformats.org/drawingml/2006/picture">
             <wp:extent cx="5580000" cy="3296535"/>
-            <wp:docPr id="7" name="Picture 7"/>
+            <wp:docPr id="11" name="Picture 11"/>
             <wp:cNvGraphicFramePr>
               <a:graphicFrameLocks noChangeAspect="1"/>
             </wp:cNvGraphicFramePr>
@@ -9868,7 +9972,7 @@
                     <pic:cNvPicPr/>
                   </pic:nvPicPr>
                   <pic:blipFill>
-                    <a:blip r:embed="rId35"/>
+                    <a:blip r:embed="rId39"/>
                     <a:stretch>
                       <a:fillRect/>
                     </a:stretch>
@@ -14432,10 +14536,10 @@
     <w:p>
       <w:pPr>
         <w:sectPr>
-          <w:headerReference w:type="default" r:id="rId36"/>
-          <w:footerReference w:type="default" r:id="rId37"/>
-          <w:headerReference w:type="first" r:id="rId38"/>
-          <w:footerReference w:type="first" r:id="rId39"/>
+          <w:headerReference w:type="default" r:id="rId40"/>
+          <w:footerReference w:type="default" r:id="rId41"/>
+          <w:headerReference w:type="first" r:id="rId42"/>
+          <w:footerReference w:type="first" r:id="rId43"/>
           <w:pgSz w:w="12240" w:h="15840"/>
           <w:pgMar w:top="1134" w:right="1134" w:bottom="1134" w:left="1701" w:header="720" w:footer="720" w:gutter="0"/>
           <w:cols w:space="720"/>
@@ -15554,10 +15658,10 @@
     <w:p>
       <w:pPr>
         <w:sectPr>
-          <w:headerReference w:type="default" r:id="rId40"/>
-          <w:footerReference w:type="default" r:id="rId41"/>
-          <w:headerReference w:type="first" r:id="rId42"/>
-          <w:footerReference w:type="first" r:id="rId43"/>
+          <w:headerReference w:type="default" r:id="rId44"/>
+          <w:footerReference w:type="default" r:id="rId45"/>
+          <w:headerReference w:type="first" r:id="rId46"/>
+          <w:footerReference w:type="first" r:id="rId47"/>
           <w:pgSz w:w="12240" w:h="15840"/>
           <w:pgMar w:top="1134" w:right="1134" w:bottom="1134" w:left="1701" w:header="720" w:footer="720" w:gutter="0"/>
           <w:cols w:space="720"/>
@@ -15628,12 +15732,38 @@
         <w:jc w:val="center"/>
       </w:pPr>
       <w:r>
-        <w:rPr>
-          <w:rFonts w:ascii="Times New Roman" w:hAnsi="Times New Roman" w:cs="Times New Roman" w:eastAsia="Times New Roman"/>
-          <w:i/>
-          <w:sz w:val="26"/>
-        </w:rPr>
-        <w:t>[HÌNH MISSING: D:\DoAn\bao-cao\assets\screenshots\buoc-1-register.png]</w:t>
+        <w:drawing>
+          <wp:inline xmlns:a="http://schemas.openxmlformats.org/drawingml/2006/main" xmlns:pic="http://schemas.openxmlformats.org/drawingml/2006/picture">
+            <wp:extent cx="4680000" cy="10128000"/>
+            <wp:docPr id="12" name="Picture 12"/>
+            <wp:cNvGraphicFramePr>
+              <a:graphicFrameLocks noChangeAspect="1"/>
+            </wp:cNvGraphicFramePr>
+            <a:graphic>
+              <a:graphicData uri="http://schemas.openxmlformats.org/drawingml/2006/picture">
+                <pic:pic>
+                  <pic:nvPicPr>
+                    <pic:cNvPr id="0" name="buoc-1-register.png"/>
+                    <pic:cNvPicPr/>
+                  </pic:nvPicPr>
+                  <pic:blipFill>
+                    <a:blip r:embed="rId52"/>
+                    <a:stretch>
+                      <a:fillRect/>
+                    </a:stretch>
+                  </pic:blipFill>
+                  <pic:spPr>
+                    <a:xfrm>
+                      <a:off x="0" y="0"/>
+                      <a:ext cx="4680000" cy="10128000"/>
+                    </a:xfrm>
+                    <a:prstGeom prst="rect"/>
+                  </pic:spPr>
+                </pic:pic>
+              </a:graphicData>
+            </a:graphic>
+          </wp:inline>
+        </w:drawing>
       </w:r>
     </w:p>
     <w:p>
@@ -15694,12 +15824,38 @@
         <w:jc w:val="center"/>
       </w:pPr>
       <w:r>
-        <w:rPr>
-          <w:rFonts w:ascii="Times New Roman" w:hAnsi="Times New Roman" w:cs="Times New Roman" w:eastAsia="Times New Roman"/>
-          <w:i/>
-          <w:sz w:val="26"/>
-        </w:rPr>
-        <w:t>[HÌNH MISSING: D:\DoAn\bao-cao\assets\screenshots\buoc-2-login.png]</w:t>
+        <w:drawing>
+          <wp:inline xmlns:a="http://schemas.openxmlformats.org/drawingml/2006/main" xmlns:pic="http://schemas.openxmlformats.org/drawingml/2006/picture">
+            <wp:extent cx="4680000" cy="10128000"/>
+            <wp:docPr id="13" name="Picture 13"/>
+            <wp:cNvGraphicFramePr>
+              <a:graphicFrameLocks noChangeAspect="1"/>
+            </wp:cNvGraphicFramePr>
+            <a:graphic>
+              <a:graphicData uri="http://schemas.openxmlformats.org/drawingml/2006/picture">
+                <pic:pic>
+                  <pic:nvPicPr>
+                    <pic:cNvPr id="0" name="buoc-2-login.png"/>
+                    <pic:cNvPicPr/>
+                  </pic:nvPicPr>
+                  <pic:blipFill>
+                    <a:blip r:embed="rId53"/>
+                    <a:stretch>
+                      <a:fillRect/>
+                    </a:stretch>
+                  </pic:blipFill>
+                  <pic:spPr>
+                    <a:xfrm>
+                      <a:off x="0" y="0"/>
+                      <a:ext cx="4680000" cy="10128000"/>
+                    </a:xfrm>
+                    <a:prstGeom prst="rect"/>
+                  </pic:spPr>
+                </pic:pic>
+              </a:graphicData>
+            </a:graphic>
+          </wp:inline>
+        </w:drawing>
       </w:r>
     </w:p>
     <w:p>
@@ -15760,12 +15916,38 @@
         <w:jc w:val="center"/>
       </w:pPr>
       <w:r>
-        <w:rPr>
-          <w:rFonts w:ascii="Times New Roman" w:hAnsi="Times New Roman" w:cs="Times New Roman" w:eastAsia="Times New Roman"/>
-          <w:i/>
-          <w:sz w:val="26"/>
-        </w:rPr>
-        <w:t>[HÌNH MISSING: D:\DoAn\bao-cao\assets\screenshots\buoc-3-member-home.png]</w:t>
+        <w:drawing>
+          <wp:inline xmlns:a="http://schemas.openxmlformats.org/drawingml/2006/main" xmlns:pic="http://schemas.openxmlformats.org/drawingml/2006/picture">
+            <wp:extent cx="4680000" cy="10128000"/>
+            <wp:docPr id="14" name="Picture 14"/>
+            <wp:cNvGraphicFramePr>
+              <a:graphicFrameLocks noChangeAspect="1"/>
+            </wp:cNvGraphicFramePr>
+            <a:graphic>
+              <a:graphicData uri="http://schemas.openxmlformats.org/drawingml/2006/picture">
+                <pic:pic>
+                  <pic:nvPicPr>
+                    <pic:cNvPr id="0" name="member-home.png"/>
+                    <pic:cNvPicPr/>
+                  </pic:nvPicPr>
+                  <pic:blipFill>
+                    <a:blip r:embed="rId35"/>
+                    <a:stretch>
+                      <a:fillRect/>
+                    </a:stretch>
+                  </pic:blipFill>
+                  <pic:spPr>
+                    <a:xfrm>
+                      <a:off x="0" y="0"/>
+                      <a:ext cx="4680000" cy="10128000"/>
+                    </a:xfrm>
+                    <a:prstGeom prst="rect"/>
+                  </pic:spPr>
+                </pic:pic>
+              </a:graphicData>
+            </a:graphic>
+          </wp:inline>
+        </w:drawing>
       </w:r>
     </w:p>
     <w:p>
@@ -15826,12 +16008,38 @@
         <w:jc w:val="center"/>
       </w:pPr>
       <w:r>
-        <w:rPr>
-          <w:rFonts w:ascii="Times New Roman" w:hAnsi="Times New Roman" w:cs="Times New Roman" w:eastAsia="Times New Roman"/>
-          <w:i/>
-          <w:sz w:val="26"/>
-        </w:rPr>
-        <w:t>[HÌNH MISSING: D:\DoAn\bao-cao\assets\screenshots\buoc-4-partner-list.png]</w:t>
+        <w:drawing>
+          <wp:inline xmlns:a="http://schemas.openxmlformats.org/drawingml/2006/main" xmlns:pic="http://schemas.openxmlformats.org/drawingml/2006/picture">
+            <wp:extent cx="4680000" cy="10128000"/>
+            <wp:docPr id="15" name="Picture 15"/>
+            <wp:cNvGraphicFramePr>
+              <a:graphicFrameLocks noChangeAspect="1"/>
+            </wp:cNvGraphicFramePr>
+            <a:graphic>
+              <a:graphicData uri="http://schemas.openxmlformats.org/drawingml/2006/picture">
+                <pic:pic>
+                  <pic:nvPicPr>
+                    <pic:cNvPr id="0" name="buoc-4-partner-list.png"/>
+                    <pic:cNvPicPr/>
+                  </pic:nvPicPr>
+                  <pic:blipFill>
+                    <a:blip r:embed="rId54"/>
+                    <a:stretch>
+                      <a:fillRect/>
+                    </a:stretch>
+                  </pic:blipFill>
+                  <pic:spPr>
+                    <a:xfrm>
+                      <a:off x="0" y="0"/>
+                      <a:ext cx="4680000" cy="10128000"/>
+                    </a:xfrm>
+                    <a:prstGeom prst="rect"/>
+                  </pic:spPr>
+                </pic:pic>
+              </a:graphicData>
+            </a:graphic>
+          </wp:inline>
+        </w:drawing>
       </w:r>
     </w:p>
     <w:p>
@@ -15892,12 +16100,38 @@
         <w:jc w:val="center"/>
       </w:pPr>
       <w:r>
-        <w:rPr>
-          <w:rFonts w:ascii="Times New Roman" w:hAnsi="Times New Roman" w:cs="Times New Roman" w:eastAsia="Times New Roman"/>
-          <w:i/>
-          <w:sz w:val="26"/>
-        </w:rPr>
-        <w:t>[HÌNH MISSING: D:\DoAn\bao-cao\assets\screenshots\buoc-5-partner-detail.png]</w:t>
+        <w:drawing>
+          <wp:inline xmlns:a="http://schemas.openxmlformats.org/drawingml/2006/main" xmlns:pic="http://schemas.openxmlformats.org/drawingml/2006/picture">
+            <wp:extent cx="4680000" cy="10128000"/>
+            <wp:docPr id="16" name="Picture 16"/>
+            <wp:cNvGraphicFramePr>
+              <a:graphicFrameLocks noChangeAspect="1"/>
+            </wp:cNvGraphicFramePr>
+            <a:graphic>
+              <a:graphicData uri="http://schemas.openxmlformats.org/drawingml/2006/picture">
+                <pic:pic>
+                  <pic:nvPicPr>
+                    <pic:cNvPr id="0" name="buoc-5-partner-detail.png"/>
+                    <pic:cNvPicPr/>
+                  </pic:nvPicPr>
+                  <pic:blipFill>
+                    <a:blip r:embed="rId55"/>
+                    <a:stretch>
+                      <a:fillRect/>
+                    </a:stretch>
+                  </pic:blipFill>
+                  <pic:spPr>
+                    <a:xfrm>
+                      <a:off x="0" y="0"/>
+                      <a:ext cx="4680000" cy="10128000"/>
+                    </a:xfrm>
+                    <a:prstGeom prst="rect"/>
+                  </pic:spPr>
+                </pic:pic>
+              </a:graphicData>
+            </a:graphic>
+          </wp:inline>
+        </w:drawing>
       </w:r>
     </w:p>
     <w:p>
@@ -15958,12 +16192,38 @@
         <w:jc w:val="center"/>
       </w:pPr>
       <w:r>
-        <w:rPr>
-          <w:rFonts w:ascii="Times New Roman" w:hAnsi="Times New Roman" w:cs="Times New Roman" w:eastAsia="Times New Roman"/>
-          <w:i/>
-          <w:sz w:val="26"/>
-        </w:rPr>
-        <w:t>[HÌNH MISSING: D:\DoAn\bao-cao\assets\screenshots\buoc-6-redeem-confirm.png]</w:t>
+        <w:drawing>
+          <wp:inline xmlns:a="http://schemas.openxmlformats.org/drawingml/2006/main" xmlns:pic="http://schemas.openxmlformats.org/drawingml/2006/picture">
+            <wp:extent cx="4680000" cy="10128000"/>
+            <wp:docPr id="17" name="Picture 17"/>
+            <wp:cNvGraphicFramePr>
+              <a:graphicFrameLocks noChangeAspect="1"/>
+            </wp:cNvGraphicFramePr>
+            <a:graphic>
+              <a:graphicData uri="http://schemas.openxmlformats.org/drawingml/2006/picture">
+                <pic:pic>
+                  <pic:nvPicPr>
+                    <pic:cNvPr id="0" name="buoc-6-redeem-confirm.png"/>
+                    <pic:cNvPicPr/>
+                  </pic:nvPicPr>
+                  <pic:blipFill>
+                    <a:blip r:embed="rId56"/>
+                    <a:stretch>
+                      <a:fillRect/>
+                    </a:stretch>
+                  </pic:blipFill>
+                  <pic:spPr>
+                    <a:xfrm>
+                      <a:off x="0" y="0"/>
+                      <a:ext cx="4680000" cy="10128000"/>
+                    </a:xfrm>
+                    <a:prstGeom prst="rect"/>
+                  </pic:spPr>
+                </pic:pic>
+              </a:graphicData>
+            </a:graphic>
+          </wp:inline>
+        </w:drawing>
       </w:r>
     </w:p>
     <w:p>
@@ -16024,12 +16284,38 @@
         <w:jc w:val="center"/>
       </w:pPr>
       <w:r>
-        <w:rPr>
-          <w:rFonts w:ascii="Times New Roman" w:hAnsi="Times New Roman" w:cs="Times New Roman" w:eastAsia="Times New Roman"/>
-          <w:i/>
-          <w:sz w:val="26"/>
-        </w:rPr>
-        <w:t>[HÌNH MISSING: D:\DoAn\bao-cao\assets\screenshots\buoc-7-voucher-list.png]</w:t>
+        <w:drawing>
+          <wp:inline xmlns:a="http://schemas.openxmlformats.org/drawingml/2006/main" xmlns:pic="http://schemas.openxmlformats.org/drawingml/2006/picture">
+            <wp:extent cx="4680000" cy="10128000"/>
+            <wp:docPr id="18" name="Picture 18"/>
+            <wp:cNvGraphicFramePr>
+              <a:graphicFrameLocks noChangeAspect="1"/>
+            </wp:cNvGraphicFramePr>
+            <a:graphic>
+              <a:graphicData uri="http://schemas.openxmlformats.org/drawingml/2006/picture">
+                <pic:pic>
+                  <pic:nvPicPr>
+                    <pic:cNvPr id="0" name="buoc-7-voucher-list.png"/>
+                    <pic:cNvPicPr/>
+                  </pic:nvPicPr>
+                  <pic:blipFill>
+                    <a:blip r:embed="rId57"/>
+                    <a:stretch>
+                      <a:fillRect/>
+                    </a:stretch>
+                  </pic:blipFill>
+                  <pic:spPr>
+                    <a:xfrm>
+                      <a:off x="0" y="0"/>
+                      <a:ext cx="4680000" cy="10128000"/>
+                    </a:xfrm>
+                    <a:prstGeom prst="rect"/>
+                  </pic:spPr>
+                </pic:pic>
+              </a:graphicData>
+            </a:graphic>
+          </wp:inline>
+        </w:drawing>
       </w:r>
     </w:p>
     <w:p>
@@ -16090,12 +16376,38 @@
         <w:jc w:val="center"/>
       </w:pPr>
       <w:r>
-        <w:rPr>
-          <w:rFonts w:ascii="Times New Roman" w:hAnsi="Times New Roman" w:cs="Times New Roman" w:eastAsia="Times New Roman"/>
-          <w:i/>
-          <w:sz w:val="26"/>
-        </w:rPr>
-        <w:t>[HÌNH MISSING: D:\DoAn\bao-cao\assets\screenshots\buoc-8-member-qr.png]</w:t>
+        <w:drawing>
+          <wp:inline xmlns:a="http://schemas.openxmlformats.org/drawingml/2006/main" xmlns:pic="http://schemas.openxmlformats.org/drawingml/2006/picture">
+            <wp:extent cx="4680000" cy="10128000"/>
+            <wp:docPr id="19" name="Picture 19"/>
+            <wp:cNvGraphicFramePr>
+              <a:graphicFrameLocks noChangeAspect="1"/>
+            </wp:cNvGraphicFramePr>
+            <a:graphic>
+              <a:graphicData uri="http://schemas.openxmlformats.org/drawingml/2006/picture">
+                <pic:pic>
+                  <pic:nvPicPr>
+                    <pic:cNvPr id="0" name="buoc-8-member-qr.png"/>
+                    <pic:cNvPicPr/>
+                  </pic:nvPicPr>
+                  <pic:blipFill>
+                    <a:blip r:embed="rId58"/>
+                    <a:stretch>
+                      <a:fillRect/>
+                    </a:stretch>
+                  </pic:blipFill>
+                  <pic:spPr>
+                    <a:xfrm>
+                      <a:off x="0" y="0"/>
+                      <a:ext cx="4680000" cy="10128000"/>
+                    </a:xfrm>
+                    <a:prstGeom prst="rect"/>
+                  </pic:spPr>
+                </pic:pic>
+              </a:graphicData>
+            </a:graphic>
+          </wp:inline>
+        </w:drawing>
       </w:r>
     </w:p>
     <w:p>
@@ -16156,12 +16468,38 @@
         <w:jc w:val="center"/>
       </w:pPr>
       <w:r>
-        <w:rPr>
-          <w:rFonts w:ascii="Times New Roman" w:hAnsi="Times New Roman" w:cs="Times New Roman" w:eastAsia="Times New Roman"/>
-          <w:i/>
-          <w:sz w:val="26"/>
-        </w:rPr>
-        <w:t>[HÌNH MISSING: D:\DoAn\bao-cao\assets\screenshots\buoc-9-staff-verify.png]</w:t>
+        <w:drawing>
+          <wp:inline xmlns:a="http://schemas.openxmlformats.org/drawingml/2006/main" xmlns:pic="http://schemas.openxmlformats.org/drawingml/2006/picture">
+            <wp:extent cx="4680000" cy="10128000"/>
+            <wp:docPr id="20" name="Picture 20"/>
+            <wp:cNvGraphicFramePr>
+              <a:graphicFrameLocks noChangeAspect="1"/>
+            </wp:cNvGraphicFramePr>
+            <a:graphic>
+              <a:graphicData uri="http://schemas.openxmlformats.org/drawingml/2006/picture">
+                <pic:pic>
+                  <pic:nvPicPr>
+                    <pic:cNvPr id="0" name="buoc-9-staff-verify.png"/>
+                    <pic:cNvPicPr/>
+                  </pic:nvPicPr>
+                  <pic:blipFill>
+                    <a:blip r:embed="rId59"/>
+                    <a:stretch>
+                      <a:fillRect/>
+                    </a:stretch>
+                  </pic:blipFill>
+                  <pic:spPr>
+                    <a:xfrm>
+                      <a:off x="0" y="0"/>
+                      <a:ext cx="4680000" cy="10128000"/>
+                    </a:xfrm>
+                    <a:prstGeom prst="rect"/>
+                  </pic:spPr>
+                </pic:pic>
+              </a:graphicData>
+            </a:graphic>
+          </wp:inline>
+        </w:drawing>
       </w:r>
     </w:p>
     <w:p>
@@ -16191,10 +16529,10 @@
     <w:p>
       <w:pPr>
         <w:sectPr>
-          <w:headerReference w:type="default" r:id="rId44"/>
-          <w:footerReference w:type="default" r:id="rId45"/>
-          <w:headerReference w:type="first" r:id="rId46"/>
-          <w:footerReference w:type="first" r:id="rId47"/>
+          <w:headerReference w:type="default" r:id="rId48"/>
+          <w:footerReference w:type="default" r:id="rId49"/>
+          <w:headerReference w:type="first" r:id="rId50"/>
+          <w:footerReference w:type="first" r:id="rId51"/>
           <w:pgSz w:w="12240" w:h="15840"/>
           <w:pgMar w:top="1134" w:right="1134" w:bottom="1134" w:left="1701" w:header="720" w:footer="720" w:gutter="0"/>
           <w:cols w:space="720"/>
@@ -16400,10 +16738,10 @@
       </w:r>
     </w:p>
     <w:sectPr>
-      <w:headerReference w:type="default" r:id="rId48"/>
-      <w:footerReference w:type="default" r:id="rId49"/>
-      <w:headerReference w:type="first" r:id="rId50"/>
-      <w:footerReference w:type="first" r:id="rId51"/>
+      <w:headerReference w:type="default" r:id="rId60"/>
+      <w:footerReference w:type="default" r:id="rId61"/>
+      <w:headerReference w:type="first" r:id="rId62"/>
+      <w:footerReference w:type="first" r:id="rId63"/>
       <w:pgSz w:w="12240" w:h="15840"/>
       <w:pgMar w:top="1134" w:right="1134" w:bottom="1134" w:left="1701" w:header="720" w:footer="720" w:gutter="0"/>
       <w:cols w:space="720"/>

</xml_diff>